<commit_message>
Poniendo en negritas las respuestas
</commit_message>
<xml_diff>
--- a/Task 1.docx
+++ b/Task 1.docx
@@ -188,16 +188,101 @@
           <w:lang w:eastAsia="en-US"/>
         </w:rPr>
       </w:pPr>
-      <w:r>
-        <w:rPr>
-          <w:rFonts w:ascii="Arial" w:hAnsi="Arial" w:cs="Arial"/>
-          <w:b/>
-          <w:bCs/>
-          <w:sz w:val="20"/>
-          <w:szCs w:val="20"/>
-          <w:lang w:eastAsia="en-US"/>
-        </w:rPr>
-        <w:t xml:space="preserve">Application Specific Integrated Circuit. </w:t>
+      <w:proofErr w:type="spellStart"/>
+      <w:r>
+        <w:rPr>
+          <w:rFonts w:ascii="Arial" w:hAnsi="Arial" w:cs="Arial"/>
+          <w:b/>
+          <w:bCs/>
+          <w:sz w:val="20"/>
+          <w:szCs w:val="20"/>
+          <w:lang w:eastAsia="en-US"/>
+        </w:rPr>
+        <w:t>Application</w:t>
+      </w:r>
+      <w:proofErr w:type="spellEnd"/>
+      <w:r>
+        <w:rPr>
+          <w:rFonts w:ascii="Arial" w:hAnsi="Arial" w:cs="Arial"/>
+          <w:b/>
+          <w:bCs/>
+          <w:sz w:val="20"/>
+          <w:szCs w:val="20"/>
+          <w:lang w:eastAsia="en-US"/>
+        </w:rPr>
+        <w:t xml:space="preserve"> </w:t>
+      </w:r>
+      <w:proofErr w:type="spellStart"/>
+      <w:r>
+        <w:rPr>
+          <w:rFonts w:ascii="Arial" w:hAnsi="Arial" w:cs="Arial"/>
+          <w:b/>
+          <w:bCs/>
+          <w:sz w:val="20"/>
+          <w:szCs w:val="20"/>
+          <w:lang w:eastAsia="en-US"/>
+        </w:rPr>
+        <w:t>Specific</w:t>
+      </w:r>
+      <w:proofErr w:type="spellEnd"/>
+      <w:r>
+        <w:rPr>
+          <w:rFonts w:ascii="Arial" w:hAnsi="Arial" w:cs="Arial"/>
+          <w:b/>
+          <w:bCs/>
+          <w:sz w:val="20"/>
+          <w:szCs w:val="20"/>
+          <w:lang w:eastAsia="en-US"/>
+        </w:rPr>
+        <w:t xml:space="preserve"> </w:t>
+      </w:r>
+      <w:proofErr w:type="spellStart"/>
+      <w:r>
+        <w:rPr>
+          <w:rFonts w:ascii="Arial" w:hAnsi="Arial" w:cs="Arial"/>
+          <w:b/>
+          <w:bCs/>
+          <w:sz w:val="20"/>
+          <w:szCs w:val="20"/>
+          <w:lang w:eastAsia="en-US"/>
+        </w:rPr>
+        <w:t>Integrated</w:t>
+      </w:r>
+      <w:proofErr w:type="spellEnd"/>
+      <w:r>
+        <w:rPr>
+          <w:rFonts w:ascii="Arial" w:hAnsi="Arial" w:cs="Arial"/>
+          <w:b/>
+          <w:bCs/>
+          <w:sz w:val="20"/>
+          <w:szCs w:val="20"/>
+          <w:lang w:eastAsia="en-US"/>
+        </w:rPr>
+        <w:t xml:space="preserve"> </w:t>
+      </w:r>
+      <w:proofErr w:type="spellStart"/>
+      <w:r>
+        <w:rPr>
+          <w:rFonts w:ascii="Arial" w:hAnsi="Arial" w:cs="Arial"/>
+          <w:b/>
+          <w:bCs/>
+          <w:sz w:val="20"/>
+          <w:szCs w:val="20"/>
+          <w:lang w:eastAsia="en-US"/>
+        </w:rPr>
+        <w:t>Circuit</w:t>
+      </w:r>
+      <w:proofErr w:type="spellEnd"/>
+      <w:r>
+        <w:rPr>
+          <w:rFonts w:ascii="Arial" w:hAnsi="Arial" w:cs="Arial"/>
+          <w:b/>
+          <w:bCs/>
+          <w:sz w:val="20"/>
+          <w:szCs w:val="20"/>
+          <w:lang w:eastAsia="en-US"/>
+        </w:rPr>
+        <w:t xml:space="preserve">. </w:t>
       </w:r>
       <w:r>
         <w:rPr>
@@ -297,8 +382,19 @@
           <w:szCs w:val="20"/>
           <w:lang w:eastAsia="en-US"/>
         </w:rPr>
-        <w:t>Ejemplos de ASICs</w:t>
-      </w:r>
+        <w:t xml:space="preserve">Ejemplos de </w:t>
+      </w:r>
+      <w:proofErr w:type="spellStart"/>
+      <w:r>
+        <w:rPr>
+          <w:rFonts w:ascii="Arial" w:hAnsi="Arial" w:cs="Arial"/>
+          <w:sz w:val="20"/>
+          <w:szCs w:val="20"/>
+          <w:lang w:eastAsia="en-US"/>
+        </w:rPr>
+        <w:t>ASICs</w:t>
+      </w:r>
+      <w:proofErr w:type="spellEnd"/>
       <w:r>
         <w:rPr>
           <w:rFonts w:ascii="Arial" w:hAnsi="Arial" w:cs="Arial"/>
@@ -396,7 +492,27 @@
           <w:szCs w:val="20"/>
           <w:lang w:eastAsia="en-US"/>
         </w:rPr>
-        <w:t>Investiga cuales son las 3 principales fundidoras de silicio (semiconductor foundries) en la actualidad</w:t>
+        <w:t xml:space="preserve">Investiga cuales son las 3 principales fundidoras de silicio (semiconductor </w:t>
+      </w:r>
+      <w:proofErr w:type="spellStart"/>
+      <w:r>
+        <w:rPr>
+          <w:rFonts w:ascii="Arial" w:hAnsi="Arial" w:cs="Arial"/>
+          <w:sz w:val="20"/>
+          <w:szCs w:val="20"/>
+          <w:lang w:eastAsia="en-US"/>
+        </w:rPr>
+        <w:t>foundries</w:t>
+      </w:r>
+      <w:proofErr w:type="spellEnd"/>
+      <w:r>
+        <w:rPr>
+          <w:rFonts w:ascii="Arial" w:hAnsi="Arial" w:cs="Arial"/>
+          <w:sz w:val="20"/>
+          <w:szCs w:val="20"/>
+          <w:lang w:eastAsia="en-US"/>
+        </w:rPr>
+        <w:t>) en la actualidad</w:t>
       </w:r>
       <w:r>
         <w:rPr>
@@ -412,32 +528,90 @@
       <w:pPr>
         <w:rPr>
           <w:rFonts w:ascii="Arial" w:hAnsi="Arial" w:cs="Arial"/>
-          <w:sz w:val="20"/>
-          <w:szCs w:val="20"/>
-          <w:lang w:eastAsia="en-US"/>
-        </w:rPr>
-      </w:pPr>
-      <w:r>
-        <w:rPr>
-          <w:rFonts w:ascii="Arial" w:hAnsi="Arial" w:cs="Arial"/>
+          <w:b/>
+          <w:bCs/>
+          <w:sz w:val="20"/>
+          <w:szCs w:val="20"/>
+          <w:lang w:eastAsia="en-US"/>
+        </w:rPr>
+      </w:pPr>
+      <w:r>
+        <w:rPr>
+          <w:rFonts w:ascii="Arial" w:hAnsi="Arial" w:cs="Arial"/>
+          <w:b/>
+          <w:bCs/>
           <w:sz w:val="20"/>
           <w:szCs w:val="20"/>
           <w:lang w:eastAsia="en-US"/>
         </w:rPr>
         <w:t xml:space="preserve">De acuerdo con </w:t>
       </w:r>
-      <w:r>
-        <w:rPr>
-          <w:rFonts w:ascii="Arial" w:hAnsi="Arial" w:cs="Arial"/>
-          <w:sz w:val="20"/>
-          <w:szCs w:val="20"/>
-          <w:lang w:eastAsia="en-US"/>
-        </w:rPr>
-        <w:t>VMR’s Q1 2026 Market Intelligence Report</w:t>
-      </w:r>
-      <w:r>
-        <w:rPr>
-          <w:rFonts w:ascii="Arial" w:hAnsi="Arial" w:cs="Arial"/>
+      <w:proofErr w:type="spellStart"/>
+      <w:r>
+        <w:rPr>
+          <w:rFonts w:ascii="Arial" w:hAnsi="Arial" w:cs="Arial"/>
+          <w:b/>
+          <w:bCs/>
+          <w:sz w:val="20"/>
+          <w:szCs w:val="20"/>
+          <w:lang w:eastAsia="en-US"/>
+        </w:rPr>
+        <w:t>VMR’s</w:t>
+      </w:r>
+      <w:proofErr w:type="spellEnd"/>
+      <w:r>
+        <w:rPr>
+          <w:rFonts w:ascii="Arial" w:hAnsi="Arial" w:cs="Arial"/>
+          <w:b/>
+          <w:bCs/>
+          <w:sz w:val="20"/>
+          <w:szCs w:val="20"/>
+          <w:lang w:eastAsia="en-US"/>
+        </w:rPr>
+        <w:t xml:space="preserve"> Q1 2026 Market </w:t>
+      </w:r>
+      <w:proofErr w:type="spellStart"/>
+      <w:r>
+        <w:rPr>
+          <w:rFonts w:ascii="Arial" w:hAnsi="Arial" w:cs="Arial"/>
+          <w:b/>
+          <w:bCs/>
+          <w:sz w:val="20"/>
+          <w:szCs w:val="20"/>
+          <w:lang w:eastAsia="en-US"/>
+        </w:rPr>
+        <w:t>Intelligence</w:t>
+      </w:r>
+      <w:proofErr w:type="spellEnd"/>
+      <w:r>
+        <w:rPr>
+          <w:rFonts w:ascii="Arial" w:hAnsi="Arial" w:cs="Arial"/>
+          <w:b/>
+          <w:bCs/>
+          <w:sz w:val="20"/>
+          <w:szCs w:val="20"/>
+          <w:lang w:eastAsia="en-US"/>
+        </w:rPr>
+        <w:t xml:space="preserve"> </w:t>
+      </w:r>
+      <w:proofErr w:type="spellStart"/>
+      <w:r>
+        <w:rPr>
+          <w:rFonts w:ascii="Arial" w:hAnsi="Arial" w:cs="Arial"/>
+          <w:b/>
+          <w:bCs/>
+          <w:sz w:val="20"/>
+          <w:szCs w:val="20"/>
+          <w:lang w:eastAsia="en-US"/>
+        </w:rPr>
+        <w:t>Report</w:t>
+      </w:r>
+      <w:proofErr w:type="spellEnd"/>
+      <w:r>
+        <w:rPr>
+          <w:rFonts w:ascii="Arial" w:hAnsi="Arial" w:cs="Arial"/>
+          <w:b/>
+          <w:bCs/>
           <w:sz w:val="20"/>
           <w:szCs w:val="20"/>
           <w:lang w:eastAsia="en-US"/>
@@ -449,43 +623,101 @@
       <w:pPr>
         <w:rPr>
           <w:rFonts w:ascii="Arial" w:hAnsi="Arial" w:cs="Arial"/>
-          <w:sz w:val="20"/>
-          <w:szCs w:val="20"/>
-          <w:lang w:eastAsia="en-US"/>
-        </w:rPr>
-      </w:pPr>
-    </w:p>
-    <w:p>
-      <w:pPr>
-        <w:rPr>
-          <w:rFonts w:ascii="Arial" w:hAnsi="Arial" w:cs="Arial"/>
-          <w:sz w:val="20"/>
-          <w:szCs w:val="20"/>
-          <w:lang w:eastAsia="en-US"/>
-        </w:rPr>
-      </w:pPr>
-      <w:r>
-        <w:rPr>
-          <w:rFonts w:ascii="Arial" w:hAnsi="Arial" w:cs="Arial"/>
-          <w:sz w:val="20"/>
-          <w:szCs w:val="20"/>
-          <w:lang w:eastAsia="en-US"/>
-        </w:rPr>
-        <w:t>Primero está Taiwan Semiconductor Manufacturing Company, es la fundidora más grande y produce para una amplia cantidad de productos para el consumidor.</w:t>
-      </w:r>
-    </w:p>
-    <w:p>
-      <w:pPr>
-        <w:rPr>
-          <w:rFonts w:ascii="Arial" w:hAnsi="Arial" w:cs="Arial"/>
-          <w:sz w:val="20"/>
-          <w:szCs w:val="20"/>
-          <w:lang w:eastAsia="en-US"/>
-        </w:rPr>
-      </w:pPr>
-      <w:r>
-        <w:rPr>
-          <w:rFonts w:ascii="Arial" w:hAnsi="Arial" w:cs="Arial"/>
+          <w:b/>
+          <w:bCs/>
+          <w:sz w:val="20"/>
+          <w:szCs w:val="20"/>
+          <w:lang w:eastAsia="en-US"/>
+        </w:rPr>
+      </w:pPr>
+    </w:p>
+    <w:p>
+      <w:pPr>
+        <w:rPr>
+          <w:rFonts w:ascii="Arial" w:hAnsi="Arial" w:cs="Arial"/>
+          <w:b/>
+          <w:bCs/>
+          <w:sz w:val="20"/>
+          <w:szCs w:val="20"/>
+          <w:lang w:eastAsia="en-US"/>
+        </w:rPr>
+      </w:pPr>
+      <w:r>
+        <w:rPr>
+          <w:rFonts w:ascii="Arial" w:hAnsi="Arial" w:cs="Arial"/>
+          <w:b/>
+          <w:bCs/>
+          <w:sz w:val="20"/>
+          <w:szCs w:val="20"/>
+          <w:lang w:eastAsia="en-US"/>
+        </w:rPr>
+        <w:t xml:space="preserve">Primero está </w:t>
+      </w:r>
+      <w:proofErr w:type="spellStart"/>
+      <w:r>
+        <w:rPr>
+          <w:rFonts w:ascii="Arial" w:hAnsi="Arial" w:cs="Arial"/>
+          <w:b/>
+          <w:bCs/>
+          <w:sz w:val="20"/>
+          <w:szCs w:val="20"/>
+          <w:lang w:eastAsia="en-US"/>
+        </w:rPr>
+        <w:t>Taiwan</w:t>
+      </w:r>
+      <w:proofErr w:type="spellEnd"/>
+      <w:r>
+        <w:rPr>
+          <w:rFonts w:ascii="Arial" w:hAnsi="Arial" w:cs="Arial"/>
+          <w:b/>
+          <w:bCs/>
+          <w:sz w:val="20"/>
+          <w:szCs w:val="20"/>
+          <w:lang w:eastAsia="en-US"/>
+        </w:rPr>
+        <w:t xml:space="preserve"> Semiconductor </w:t>
+      </w:r>
+      <w:proofErr w:type="spellStart"/>
+      <w:r>
+        <w:rPr>
+          <w:rFonts w:ascii="Arial" w:hAnsi="Arial" w:cs="Arial"/>
+          <w:b/>
+          <w:bCs/>
+          <w:sz w:val="20"/>
+          <w:szCs w:val="20"/>
+          <w:lang w:eastAsia="en-US"/>
+        </w:rPr>
+        <w:t>Manufacturing</w:t>
+      </w:r>
+      <w:proofErr w:type="spellEnd"/>
+      <w:r>
+        <w:rPr>
+          <w:rFonts w:ascii="Arial" w:hAnsi="Arial" w:cs="Arial"/>
+          <w:b/>
+          <w:bCs/>
+          <w:sz w:val="20"/>
+          <w:szCs w:val="20"/>
+          <w:lang w:eastAsia="en-US"/>
+        </w:rPr>
+        <w:t xml:space="preserve"> Company, es la fundidora más grande y produce para una amplia cantidad de productos para el consumidor.</w:t>
+      </w:r>
+    </w:p>
+    <w:p>
+      <w:pPr>
+        <w:rPr>
+          <w:rFonts w:ascii="Arial" w:hAnsi="Arial" w:cs="Arial"/>
+          <w:b/>
+          <w:bCs/>
+          <w:sz w:val="20"/>
+          <w:szCs w:val="20"/>
+          <w:lang w:eastAsia="en-US"/>
+        </w:rPr>
+      </w:pPr>
+      <w:r>
+        <w:rPr>
+          <w:rFonts w:ascii="Arial" w:hAnsi="Arial" w:cs="Arial"/>
+          <w:b/>
+          <w:bCs/>
           <w:sz w:val="20"/>
           <w:szCs w:val="20"/>
           <w:lang w:eastAsia="en-US"/>
@@ -495,34 +727,162 @@
       <w:r>
         <w:rPr>
           <w:rFonts w:ascii="Arial" w:hAnsi="Arial" w:cs="Arial"/>
-          <w:sz w:val="20"/>
-          <w:szCs w:val="20"/>
-          <w:lang w:eastAsia="en-US"/>
-        </w:rPr>
-        <w:t xml:space="preserve"> está apostándole a su tecnología GAA (Gate all around) para producir a 2nm tomando el mercado que le sobra a TSMC.</w:t>
-      </w:r>
-    </w:p>
-    <w:p>
-      <w:pPr>
-        <w:rPr>
-          <w:rFonts w:ascii="Arial" w:hAnsi="Arial" w:cs="Arial"/>
-          <w:sz w:val="20"/>
-          <w:szCs w:val="20"/>
-          <w:lang w:eastAsia="en-US"/>
-        </w:rPr>
-      </w:pPr>
-      <w:r>
-        <w:rPr>
-          <w:rFonts w:ascii="Arial" w:hAnsi="Arial" w:cs="Arial"/>
-          <w:sz w:val="20"/>
-          <w:szCs w:val="20"/>
-          <w:lang w:eastAsia="en-US"/>
-        </w:rPr>
-        <w:t xml:space="preserve">Tercero está United Microelectronics Corporation, </w:t>
-      </w:r>
-      <w:r>
-        <w:rPr>
-          <w:rFonts w:ascii="Arial" w:hAnsi="Arial" w:cs="Arial"/>
+          <w:b/>
+          <w:bCs/>
+          <w:sz w:val="20"/>
+          <w:szCs w:val="20"/>
+          <w:lang w:eastAsia="en-US"/>
+        </w:rPr>
+        <w:t xml:space="preserve"> está apostándole a su tecnología GAA (Gate </w:t>
+      </w:r>
+      <w:proofErr w:type="spellStart"/>
+      <w:r>
+        <w:rPr>
+          <w:rFonts w:ascii="Arial" w:hAnsi="Arial" w:cs="Arial"/>
+          <w:b/>
+          <w:bCs/>
+          <w:sz w:val="20"/>
+          <w:szCs w:val="20"/>
+          <w:lang w:eastAsia="en-US"/>
+        </w:rPr>
+        <w:t>all</w:t>
+      </w:r>
+      <w:proofErr w:type="spellEnd"/>
+      <w:r>
+        <w:rPr>
+          <w:rFonts w:ascii="Arial" w:hAnsi="Arial" w:cs="Arial"/>
+          <w:b/>
+          <w:bCs/>
+          <w:sz w:val="20"/>
+          <w:szCs w:val="20"/>
+          <w:lang w:eastAsia="en-US"/>
+        </w:rPr>
+        <w:t xml:space="preserve"> </w:t>
+      </w:r>
+      <w:proofErr w:type="spellStart"/>
+      <w:r>
+        <w:rPr>
+          <w:rFonts w:ascii="Arial" w:hAnsi="Arial" w:cs="Arial"/>
+          <w:b/>
+          <w:bCs/>
+          <w:sz w:val="20"/>
+          <w:szCs w:val="20"/>
+          <w:lang w:eastAsia="en-US"/>
+        </w:rPr>
+        <w:t>around</w:t>
+      </w:r>
+      <w:proofErr w:type="spellEnd"/>
+      <w:r>
+        <w:rPr>
+          <w:rFonts w:ascii="Arial" w:hAnsi="Arial" w:cs="Arial"/>
+          <w:b/>
+          <w:bCs/>
+          <w:sz w:val="20"/>
+          <w:szCs w:val="20"/>
+          <w:lang w:eastAsia="en-US"/>
+        </w:rPr>
+        <w:t>) para producir a 2nm tomando el mercado que le sobra a TSMC.</w:t>
+      </w:r>
+    </w:p>
+    <w:p>
+      <w:pPr>
+        <w:rPr>
+          <w:rFonts w:ascii="Arial" w:hAnsi="Arial" w:cs="Arial"/>
+          <w:b/>
+          <w:bCs/>
+          <w:sz w:val="20"/>
+          <w:szCs w:val="20"/>
+          <w:lang w:eastAsia="en-US"/>
+        </w:rPr>
+      </w:pPr>
+      <w:r>
+        <w:rPr>
+          <w:rFonts w:ascii="Arial" w:hAnsi="Arial" w:cs="Arial"/>
+          <w:b/>
+          <w:bCs/>
+          <w:sz w:val="20"/>
+          <w:szCs w:val="20"/>
+          <w:lang w:eastAsia="en-US"/>
+        </w:rPr>
+        <w:t xml:space="preserve">Tercero está </w:t>
+      </w:r>
+      <w:proofErr w:type="spellStart"/>
+      <w:r>
+        <w:rPr>
+          <w:rFonts w:ascii="Arial" w:hAnsi="Arial" w:cs="Arial"/>
+          <w:b/>
+          <w:bCs/>
+          <w:sz w:val="20"/>
+          <w:szCs w:val="20"/>
+          <w:lang w:eastAsia="en-US"/>
+        </w:rPr>
+        <w:t>United</w:t>
+      </w:r>
+      <w:proofErr w:type="spellEnd"/>
+      <w:r>
+        <w:rPr>
+          <w:rFonts w:ascii="Arial" w:hAnsi="Arial" w:cs="Arial"/>
+          <w:b/>
+          <w:bCs/>
+          <w:sz w:val="20"/>
+          <w:szCs w:val="20"/>
+          <w:lang w:eastAsia="en-US"/>
+        </w:rPr>
+        <w:t xml:space="preserve"> </w:t>
+      </w:r>
+      <w:proofErr w:type="spellStart"/>
+      <w:r>
+        <w:rPr>
+          <w:rFonts w:ascii="Arial" w:hAnsi="Arial" w:cs="Arial"/>
+          <w:b/>
+          <w:bCs/>
+          <w:sz w:val="20"/>
+          <w:szCs w:val="20"/>
+          <w:lang w:eastAsia="en-US"/>
+        </w:rPr>
+        <w:t>Microelectronics</w:t>
+      </w:r>
+      <w:proofErr w:type="spellEnd"/>
+      <w:r>
+        <w:rPr>
+          <w:rFonts w:ascii="Arial" w:hAnsi="Arial" w:cs="Arial"/>
+          <w:b/>
+          <w:bCs/>
+          <w:sz w:val="20"/>
+          <w:szCs w:val="20"/>
+          <w:lang w:eastAsia="en-US"/>
+        </w:rPr>
+        <w:t xml:space="preserve"> </w:t>
+      </w:r>
+      <w:proofErr w:type="spellStart"/>
+      <w:r>
+        <w:rPr>
+          <w:rFonts w:ascii="Arial" w:hAnsi="Arial" w:cs="Arial"/>
+          <w:b/>
+          <w:bCs/>
+          <w:sz w:val="20"/>
+          <w:szCs w:val="20"/>
+          <w:lang w:eastAsia="en-US"/>
+        </w:rPr>
+        <w:t>Corporation</w:t>
+      </w:r>
+      <w:proofErr w:type="spellEnd"/>
+      <w:r>
+        <w:rPr>
+          <w:rFonts w:ascii="Arial" w:hAnsi="Arial" w:cs="Arial"/>
+          <w:b/>
+          <w:bCs/>
+          <w:sz w:val="20"/>
+          <w:szCs w:val="20"/>
+          <w:lang w:eastAsia="en-US"/>
+        </w:rPr>
+        <w:t xml:space="preserve">, </w:t>
+      </w:r>
+      <w:r>
+        <w:rPr>
+          <w:rFonts w:ascii="Arial" w:hAnsi="Arial" w:cs="Arial"/>
+          <w:b/>
+          <w:bCs/>
           <w:sz w:val="20"/>
           <w:szCs w:val="20"/>
           <w:lang w:eastAsia="en-US"/>
@@ -568,32 +928,77 @@
       <w:pPr>
         <w:rPr>
           <w:rFonts w:ascii="Arial" w:hAnsi="Arial" w:cs="Arial"/>
-          <w:sz w:val="20"/>
-          <w:szCs w:val="20"/>
-          <w:lang w:eastAsia="en-US"/>
-        </w:rPr>
-      </w:pPr>
-      <w:r>
-        <w:rPr>
-          <w:rFonts w:ascii="Arial" w:hAnsi="Arial" w:cs="Arial"/>
-          <w:sz w:val="20"/>
-          <w:szCs w:val="20"/>
-          <w:lang w:eastAsia="en-US"/>
-        </w:rPr>
-        <w:t>Captura tomada del video MrUniversity[4].</w:t>
-      </w:r>
-    </w:p>
-    <w:p>
-      <w:pPr>
-        <w:rPr>
-          <w:rFonts w:ascii="Arial" w:hAnsi="Arial" w:cs="Arial"/>
-          <w:sz w:val="20"/>
-          <w:szCs w:val="20"/>
-          <w:lang w:eastAsia="en-US"/>
-        </w:rPr>
-      </w:pPr>
-      <w:r>
-        <w:rPr>
+          <w:b/>
+          <w:bCs/>
+          <w:sz w:val="20"/>
+          <w:szCs w:val="20"/>
+          <w:lang w:eastAsia="en-US"/>
+        </w:rPr>
+      </w:pPr>
+      <w:r>
+        <w:rPr>
+          <w:rFonts w:ascii="Arial" w:hAnsi="Arial" w:cs="Arial"/>
+          <w:b/>
+          <w:bCs/>
+          <w:sz w:val="20"/>
+          <w:szCs w:val="20"/>
+          <w:lang w:eastAsia="en-US"/>
+        </w:rPr>
+        <w:t xml:space="preserve">Captura tomada del video </w:t>
+      </w:r>
+      <w:proofErr w:type="spellStart"/>
+      <w:proofErr w:type="gramStart"/>
+      <w:r>
+        <w:rPr>
+          <w:rFonts w:ascii="Arial" w:hAnsi="Arial" w:cs="Arial"/>
+          <w:b/>
+          <w:bCs/>
+          <w:sz w:val="20"/>
+          <w:szCs w:val="20"/>
+          <w:lang w:eastAsia="en-US"/>
+        </w:rPr>
+        <w:t>MrUniversity</w:t>
+      </w:r>
+      <w:proofErr w:type="spellEnd"/>
+      <w:r>
+        <w:rPr>
+          <w:rFonts w:ascii="Arial" w:hAnsi="Arial" w:cs="Arial"/>
+          <w:b/>
+          <w:bCs/>
+          <w:sz w:val="20"/>
+          <w:szCs w:val="20"/>
+          <w:lang w:eastAsia="en-US"/>
+        </w:rPr>
+        <w:t>[</w:t>
+      </w:r>
+      <w:proofErr w:type="gramEnd"/>
+      <w:r>
+        <w:rPr>
+          <w:rFonts w:ascii="Arial" w:hAnsi="Arial" w:cs="Arial"/>
+          <w:b/>
+          <w:bCs/>
+          <w:sz w:val="20"/>
+          <w:szCs w:val="20"/>
+          <w:lang w:eastAsia="en-US"/>
+        </w:rPr>
+        <w:t>4].</w:t>
+      </w:r>
+    </w:p>
+    <w:p>
+      <w:pPr>
+        <w:rPr>
+          <w:rFonts w:ascii="Arial" w:hAnsi="Arial" w:cs="Arial"/>
+          <w:b/>
+          <w:bCs/>
+          <w:sz w:val="20"/>
+          <w:szCs w:val="20"/>
+          <w:lang w:eastAsia="en-US"/>
+        </w:rPr>
+      </w:pPr>
+      <w:r>
+        <w:rPr>
+          <w:b/>
+          <w:bCs/>
           <w:noProof/>
         </w:rPr>
         <w:drawing>
@@ -650,29 +1055,131 @@
       <w:pPr>
         <w:rPr>
           <w:rFonts w:ascii="Arial" w:hAnsi="Arial" w:cs="Arial"/>
-          <w:sz w:val="20"/>
-          <w:szCs w:val="20"/>
-          <w:lang w:eastAsia="en-US"/>
-        </w:rPr>
-      </w:pPr>
-    </w:p>
-    <w:p>
-      <w:pPr>
-        <w:rPr>
-          <w:rFonts w:ascii="Arial" w:hAnsi="Arial" w:cs="Arial"/>
-          <w:sz w:val="20"/>
-          <w:szCs w:val="20"/>
-          <w:lang w:eastAsia="en-US"/>
-        </w:rPr>
-      </w:pPr>
-      <w:r>
-        <w:rPr>
-          <w:rFonts w:ascii="Arial" w:hAnsi="Arial" w:cs="Arial"/>
-          <w:sz w:val="20"/>
-          <w:szCs w:val="20"/>
-          <w:lang w:eastAsia="en-US"/>
-        </w:rPr>
-        <w:t>El Pmos con 0 conecta y 1 desconecta, y el Nmos al revés. Entonces para el NOT, con 0 deja pasar el Vcc y con 1 conecta a GND, volteando efectivamente la señal. Para el NAND se hace un OR con el VCC para que si cualquiera o ambos se está en 0 pase el VCC y esta en serie el GND para que a fuerzas tengan que estar los dos en 1 para que se conecte a GND. Y al revés para el NOR, en serie el VCC para que obligar ambos en 0 y OR en GND.</w:t>
+          <w:b/>
+          <w:bCs/>
+          <w:sz w:val="20"/>
+          <w:szCs w:val="20"/>
+          <w:lang w:eastAsia="en-US"/>
+        </w:rPr>
+      </w:pPr>
+    </w:p>
+    <w:p>
+      <w:pPr>
+        <w:rPr>
+          <w:rFonts w:ascii="Arial" w:hAnsi="Arial" w:cs="Arial"/>
+          <w:b/>
+          <w:bCs/>
+          <w:sz w:val="20"/>
+          <w:szCs w:val="20"/>
+          <w:lang w:eastAsia="en-US"/>
+        </w:rPr>
+      </w:pPr>
+      <w:r>
+        <w:rPr>
+          <w:rFonts w:ascii="Arial" w:hAnsi="Arial" w:cs="Arial"/>
+          <w:b/>
+          <w:bCs/>
+          <w:sz w:val="20"/>
+          <w:szCs w:val="20"/>
+          <w:lang w:eastAsia="en-US"/>
+        </w:rPr>
+        <w:t xml:space="preserve">El </w:t>
+      </w:r>
+      <w:proofErr w:type="spellStart"/>
+      <w:r>
+        <w:rPr>
+          <w:rFonts w:ascii="Arial" w:hAnsi="Arial" w:cs="Arial"/>
+          <w:b/>
+          <w:bCs/>
+          <w:sz w:val="20"/>
+          <w:szCs w:val="20"/>
+          <w:lang w:eastAsia="en-US"/>
+        </w:rPr>
+        <w:t>Pmos</w:t>
+      </w:r>
+      <w:proofErr w:type="spellEnd"/>
+      <w:r>
+        <w:rPr>
+          <w:rFonts w:ascii="Arial" w:hAnsi="Arial" w:cs="Arial"/>
+          <w:b/>
+          <w:bCs/>
+          <w:sz w:val="20"/>
+          <w:szCs w:val="20"/>
+          <w:lang w:eastAsia="en-US"/>
+        </w:rPr>
+        <w:t xml:space="preserve"> con 0 conecta y 1 desconecta, y el </w:t>
+      </w:r>
+      <w:proofErr w:type="spellStart"/>
+      <w:r>
+        <w:rPr>
+          <w:rFonts w:ascii="Arial" w:hAnsi="Arial" w:cs="Arial"/>
+          <w:b/>
+          <w:bCs/>
+          <w:sz w:val="20"/>
+          <w:szCs w:val="20"/>
+          <w:lang w:eastAsia="en-US"/>
+        </w:rPr>
+        <w:t>Nmos</w:t>
+      </w:r>
+      <w:proofErr w:type="spellEnd"/>
+      <w:r>
+        <w:rPr>
+          <w:rFonts w:ascii="Arial" w:hAnsi="Arial" w:cs="Arial"/>
+          <w:b/>
+          <w:bCs/>
+          <w:sz w:val="20"/>
+          <w:szCs w:val="20"/>
+          <w:lang w:eastAsia="en-US"/>
+        </w:rPr>
+        <w:t xml:space="preserve"> al revés. Entonces para el NOT, con 0 deja pasar el </w:t>
+      </w:r>
+      <w:proofErr w:type="spellStart"/>
+      <w:r>
+        <w:rPr>
+          <w:rFonts w:ascii="Arial" w:hAnsi="Arial" w:cs="Arial"/>
+          <w:b/>
+          <w:bCs/>
+          <w:sz w:val="20"/>
+          <w:szCs w:val="20"/>
+          <w:lang w:eastAsia="en-US"/>
+        </w:rPr>
+        <w:t>Vcc</w:t>
+      </w:r>
+      <w:proofErr w:type="spellEnd"/>
+      <w:r>
+        <w:rPr>
+          <w:rFonts w:ascii="Arial" w:hAnsi="Arial" w:cs="Arial"/>
+          <w:b/>
+          <w:bCs/>
+          <w:sz w:val="20"/>
+          <w:szCs w:val="20"/>
+          <w:lang w:eastAsia="en-US"/>
+        </w:rPr>
+        <w:t xml:space="preserve"> y con 1 conecta a GND, volteando efectivamente la señal. Para el NAND se hace un OR con el VCC para que si cualquiera o ambos se está en 0 pase el VCC y </w:t>
+      </w:r>
+      <w:proofErr w:type="spellStart"/>
+      <w:r>
+        <w:rPr>
+          <w:rFonts w:ascii="Arial" w:hAnsi="Arial" w:cs="Arial"/>
+          <w:b/>
+          <w:bCs/>
+          <w:sz w:val="20"/>
+          <w:szCs w:val="20"/>
+          <w:lang w:eastAsia="en-US"/>
+        </w:rPr>
+        <w:t>esta</w:t>
+      </w:r>
+      <w:proofErr w:type="spellEnd"/>
+      <w:r>
+        <w:rPr>
+          <w:rFonts w:ascii="Arial" w:hAnsi="Arial" w:cs="Arial"/>
+          <w:b/>
+          <w:bCs/>
+          <w:sz w:val="20"/>
+          <w:szCs w:val="20"/>
+          <w:lang w:eastAsia="en-US"/>
+        </w:rPr>
+        <w:t xml:space="preserve"> en serie el GND para que a fuerzas tengan que estar los dos en 1 para que se conecte a GND. Y al revés para el NOR, en serie el VCC para que obligar ambos en 0 y OR en GND.</w:t>
       </w:r>
     </w:p>
     <w:p>
@@ -706,21 +1213,65 @@
           <w:szCs w:val="20"/>
           <w:lang w:eastAsia="en-US"/>
         </w:rPr>
-        <w:t xml:space="preserve">¿Qué es Floating-gate transitor, FAMOS, FLOTOX? </w:t>
-      </w:r>
-    </w:p>
-    <w:p>
-      <w:pPr>
-        <w:rPr>
-          <w:rFonts w:ascii="Arial" w:hAnsi="Arial" w:cs="Arial"/>
-          <w:sz w:val="20"/>
-          <w:szCs w:val="20"/>
-          <w:lang w:eastAsia="en-US"/>
-        </w:rPr>
-      </w:pPr>
-      <w:r>
-        <w:rPr>
-          <w:rFonts w:ascii="Arial" w:hAnsi="Arial" w:cs="Arial"/>
+        <w:t xml:space="preserve">¿Qué es </w:t>
+      </w:r>
+      <w:proofErr w:type="spellStart"/>
+      <w:r>
+        <w:rPr>
+          <w:rFonts w:ascii="Arial" w:hAnsi="Arial" w:cs="Arial"/>
+          <w:sz w:val="20"/>
+          <w:szCs w:val="20"/>
+          <w:lang w:eastAsia="en-US"/>
+        </w:rPr>
+        <w:t>Floating</w:t>
+      </w:r>
+      <w:proofErr w:type="spellEnd"/>
+      <w:r>
+        <w:rPr>
+          <w:rFonts w:ascii="Arial" w:hAnsi="Arial" w:cs="Arial"/>
+          <w:sz w:val="20"/>
+          <w:szCs w:val="20"/>
+          <w:lang w:eastAsia="en-US"/>
+        </w:rPr>
+        <w:t xml:space="preserve">-gate </w:t>
+      </w:r>
+      <w:proofErr w:type="spellStart"/>
+      <w:r>
+        <w:rPr>
+          <w:rFonts w:ascii="Arial" w:hAnsi="Arial" w:cs="Arial"/>
+          <w:sz w:val="20"/>
+          <w:szCs w:val="20"/>
+          <w:lang w:eastAsia="en-US"/>
+        </w:rPr>
+        <w:t>transitor</w:t>
+      </w:r>
+      <w:proofErr w:type="spellEnd"/>
+      <w:r>
+        <w:rPr>
+          <w:rFonts w:ascii="Arial" w:hAnsi="Arial" w:cs="Arial"/>
+          <w:sz w:val="20"/>
+          <w:szCs w:val="20"/>
+          <w:lang w:eastAsia="en-US"/>
+        </w:rPr>
+        <w:t xml:space="preserve">, FAMOS, FLOTOX? </w:t>
+      </w:r>
+    </w:p>
+    <w:p>
+      <w:pPr>
+        <w:rPr>
+          <w:rFonts w:ascii="Arial" w:hAnsi="Arial" w:cs="Arial"/>
+          <w:b/>
+          <w:bCs/>
+          <w:sz w:val="20"/>
+          <w:szCs w:val="20"/>
+          <w:lang w:eastAsia="en-US"/>
+        </w:rPr>
+      </w:pPr>
+      <w:r>
+        <w:rPr>
+          <w:rFonts w:ascii="Arial" w:hAnsi="Arial" w:cs="Arial"/>
+          <w:b/>
+          <w:bCs/>
           <w:sz w:val="20"/>
           <w:szCs w:val="20"/>
           <w:lang w:eastAsia="en-US"/>
@@ -730,15 +1281,43 @@
       <w:r>
         <w:rPr>
           <w:rFonts w:ascii="Arial" w:hAnsi="Arial" w:cs="Arial"/>
-          <w:sz w:val="20"/>
-          <w:szCs w:val="20"/>
-          <w:lang w:eastAsia="en-US"/>
-        </w:rPr>
-        <w:t>de polysilicon aislada por óxido</w:t>
-      </w:r>
-      <w:r>
-        <w:rPr>
-          <w:rFonts w:ascii="Arial" w:hAnsi="Arial" w:cs="Arial"/>
+          <w:b/>
+          <w:bCs/>
+          <w:sz w:val="20"/>
+          <w:szCs w:val="20"/>
+          <w:lang w:eastAsia="en-US"/>
+        </w:rPr>
+        <w:t xml:space="preserve">de </w:t>
+      </w:r>
+      <w:proofErr w:type="spellStart"/>
+      <w:r>
+        <w:rPr>
+          <w:rFonts w:ascii="Arial" w:hAnsi="Arial" w:cs="Arial"/>
+          <w:b/>
+          <w:bCs/>
+          <w:sz w:val="20"/>
+          <w:szCs w:val="20"/>
+          <w:lang w:eastAsia="en-US"/>
+        </w:rPr>
+        <w:t>polysilicon</w:t>
+      </w:r>
+      <w:proofErr w:type="spellEnd"/>
+      <w:r>
+        <w:rPr>
+          <w:rFonts w:ascii="Arial" w:hAnsi="Arial" w:cs="Arial"/>
+          <w:b/>
+          <w:bCs/>
+          <w:sz w:val="20"/>
+          <w:szCs w:val="20"/>
+          <w:lang w:eastAsia="en-US"/>
+        </w:rPr>
+        <w:t xml:space="preserve"> aislada por óxido</w:t>
+      </w:r>
+      <w:r>
+        <w:rPr>
+          <w:rFonts w:ascii="Arial" w:hAnsi="Arial" w:cs="Arial"/>
+          <w:b/>
+          <w:bCs/>
           <w:sz w:val="20"/>
           <w:szCs w:val="20"/>
           <w:lang w:eastAsia="en-US"/>
@@ -748,6 +1327,8 @@
       <w:r>
         <w:rPr>
           <w:rFonts w:ascii="Arial" w:hAnsi="Arial" w:cs="Arial"/>
+          <w:b/>
+          <w:bCs/>
           <w:sz w:val="20"/>
           <w:szCs w:val="20"/>
           <w:lang w:eastAsia="en-US"/>
@@ -757,6 +1338,8 @@
       <w:r>
         <w:rPr>
           <w:rFonts w:ascii="Arial" w:hAnsi="Arial" w:cs="Arial"/>
+          <w:b/>
+          <w:bCs/>
           <w:sz w:val="20"/>
           <w:szCs w:val="20"/>
           <w:lang w:eastAsia="en-US"/>
@@ -766,6 +1349,8 @@
       <w:r>
         <w:rPr>
           <w:rFonts w:ascii="Arial" w:hAnsi="Arial" w:cs="Arial"/>
+          <w:b/>
+          <w:bCs/>
           <w:sz w:val="20"/>
           <w:szCs w:val="20"/>
           <w:lang w:eastAsia="en-US"/>
@@ -811,14 +1396,18 @@
       <w:pPr>
         <w:rPr>
           <w:rFonts w:ascii="Arial" w:hAnsi="Arial" w:cs="Arial"/>
-          <w:sz w:val="20"/>
-          <w:szCs w:val="20"/>
-          <w:lang w:eastAsia="en-US"/>
-        </w:rPr>
-      </w:pPr>
-      <w:r>
-        <w:rPr>
-          <w:rFonts w:ascii="Arial" w:hAnsi="Arial" w:cs="Arial"/>
+          <w:b/>
+          <w:bCs/>
+          <w:sz w:val="20"/>
+          <w:szCs w:val="20"/>
+          <w:lang w:eastAsia="en-US"/>
+        </w:rPr>
+      </w:pPr>
+      <w:r>
+        <w:rPr>
+          <w:rFonts w:ascii="Arial" w:hAnsi="Arial" w:cs="Arial"/>
+          <w:b/>
+          <w:bCs/>
           <w:sz w:val="20"/>
           <w:szCs w:val="20"/>
           <w:lang w:eastAsia="en-US"/>
@@ -828,6 +1417,8 @@
       <w:r>
         <w:rPr>
           <w:rFonts w:ascii="Arial" w:hAnsi="Arial" w:cs="Arial"/>
+          <w:b/>
+          <w:bCs/>
           <w:sz w:val="20"/>
           <w:szCs w:val="20"/>
           <w:lang w:eastAsia="en-US"/>
@@ -837,6 +1428,8 @@
       <w:r>
         <w:rPr>
           <w:rFonts w:ascii="Arial" w:hAnsi="Arial" w:cs="Arial"/>
+          <w:b/>
+          <w:bCs/>
           <w:sz w:val="20"/>
           <w:szCs w:val="20"/>
           <w:lang w:eastAsia="en-US"/>
@@ -846,6 +1439,8 @@
       <w:r>
         <w:rPr>
           <w:rFonts w:ascii="Arial" w:hAnsi="Arial" w:cs="Arial"/>
+          <w:b/>
+          <w:bCs/>
           <w:sz w:val="20"/>
           <w:szCs w:val="20"/>
           <w:lang w:eastAsia="en-US"/>
@@ -855,6 +1450,8 @@
       <w:r>
         <w:rPr>
           <w:rFonts w:ascii="Arial" w:hAnsi="Arial" w:cs="Arial"/>
+          <w:b/>
+          <w:bCs/>
           <w:sz w:val="20"/>
           <w:szCs w:val="20"/>
           <w:lang w:eastAsia="en-US"/>
@@ -864,6 +1461,8 @@
       <w:r>
         <w:rPr>
           <w:rFonts w:ascii="Arial" w:hAnsi="Arial" w:cs="Arial"/>
+          <w:b/>
+          <w:bCs/>
           <w:sz w:val="20"/>
           <w:szCs w:val="20"/>
           <w:lang w:eastAsia="en-US"/>
@@ -873,6 +1472,8 @@
       <w:r>
         <w:rPr>
           <w:rFonts w:ascii="Arial" w:hAnsi="Arial" w:cs="Arial"/>
+          <w:b/>
+          <w:bCs/>
           <w:sz w:val="20"/>
           <w:szCs w:val="20"/>
           <w:lang w:eastAsia="en-US"/>
@@ -882,6 +1483,8 @@
       <w:r>
         <w:rPr>
           <w:rFonts w:ascii="Arial" w:hAnsi="Arial" w:cs="Arial"/>
+          <w:b/>
+          <w:bCs/>
           <w:sz w:val="20"/>
           <w:szCs w:val="20"/>
           <w:lang w:eastAsia="en-US"/>
@@ -922,6 +1525,7 @@
         </w:rPr>
         <w:t xml:space="preserve">¿Cuál es la diferencia de un código de </w:t>
       </w:r>
+      <w:proofErr w:type="spellStart"/>
       <w:r>
         <w:rPr>
           <w:rFonts w:ascii="Arial" w:hAnsi="Arial" w:cs="Arial"/>
@@ -938,21 +1542,35 @@
           <w:szCs w:val="20"/>
           <w:lang w:eastAsia="en-US"/>
         </w:rPr>
-        <w:t>erilog sintetizable y no sintetizable?</w:t>
-      </w:r>
-    </w:p>
-    <w:p>
-      <w:pPr>
-        <w:rPr>
-          <w:rFonts w:ascii="Arial" w:hAnsi="Arial" w:cs="Arial"/>
-          <w:sz w:val="20"/>
-          <w:szCs w:val="20"/>
-          <w:lang w:eastAsia="en-US"/>
-        </w:rPr>
-      </w:pPr>
-      <w:r>
-        <w:rPr>
-          <w:rFonts w:ascii="Arial" w:hAnsi="Arial" w:cs="Arial"/>
+        <w:t>erilog</w:t>
+      </w:r>
+      <w:proofErr w:type="spellEnd"/>
+      <w:r>
+        <w:rPr>
+          <w:rFonts w:ascii="Arial" w:hAnsi="Arial" w:cs="Arial"/>
+          <w:sz w:val="20"/>
+          <w:szCs w:val="20"/>
+          <w:lang w:eastAsia="en-US"/>
+        </w:rPr>
+        <w:t xml:space="preserve"> sintetizable y no sintetizable?</w:t>
+      </w:r>
+    </w:p>
+    <w:p>
+      <w:pPr>
+        <w:rPr>
+          <w:rFonts w:ascii="Arial" w:hAnsi="Arial" w:cs="Arial"/>
+          <w:b/>
+          <w:bCs/>
+          <w:sz w:val="20"/>
+          <w:szCs w:val="20"/>
+          <w:lang w:eastAsia="en-US"/>
+        </w:rPr>
+      </w:pPr>
+      <w:r>
+        <w:rPr>
+          <w:rFonts w:ascii="Arial" w:hAnsi="Arial" w:cs="Arial"/>
+          <w:b/>
+          <w:bCs/>
           <w:sz w:val="20"/>
           <w:szCs w:val="20"/>
           <w:lang w:eastAsia="en-US"/>
@@ -998,41 +1616,29 @@
       <w:pPr>
         <w:rPr>
           <w:rFonts w:ascii="Arial" w:hAnsi="Arial" w:cs="Arial"/>
-          <w:sz w:val="20"/>
-          <w:szCs w:val="20"/>
-          <w:lang w:eastAsia="en-US"/>
-        </w:rPr>
-      </w:pPr>
-      <w:r>
-        <w:rPr>
-          <w:rFonts w:ascii="Arial" w:hAnsi="Arial" w:cs="Arial"/>
-          <w:sz w:val="20"/>
-          <w:szCs w:val="20"/>
-          <w:lang w:val="en-US" w:eastAsia="en-US"/>
-        </w:rPr>
-        <w:t xml:space="preserve">Field Programable Gate Array. </w:t>
-      </w:r>
-      <w:r>
-        <w:rPr>
-          <w:rFonts w:ascii="Arial" w:hAnsi="Arial" w:cs="Arial"/>
-          <w:sz w:val="20"/>
-          <w:szCs w:val="20"/>
-          <w:lang w:eastAsia="en-US"/>
-        </w:rPr>
-        <w:t>Es un circuito integrado</w:t>
-      </w:r>
-      <w:r>
-        <w:rPr>
-          <w:rFonts w:ascii="Arial" w:hAnsi="Arial" w:cs="Arial"/>
-          <w:sz w:val="20"/>
-          <w:szCs w:val="20"/>
-          <w:lang w:eastAsia="en-US"/>
-        </w:rPr>
-        <w:t xml:space="preserve"> cuyas compuertas </w:t>
-      </w:r>
-      <w:r>
-        <w:rPr>
-          <w:rFonts w:ascii="Arial" w:hAnsi="Arial" w:cs="Arial"/>
+          <w:b/>
+          <w:bCs/>
+          <w:sz w:val="20"/>
+          <w:szCs w:val="20"/>
+          <w:lang w:eastAsia="en-US"/>
+        </w:rPr>
+      </w:pPr>
+      <w:r>
+        <w:rPr>
+          <w:rFonts w:ascii="Arial" w:hAnsi="Arial" w:cs="Arial"/>
+          <w:b/>
+          <w:bCs/>
+          <w:sz w:val="20"/>
+          <w:szCs w:val="20"/>
+          <w:lang w:eastAsia="en-US"/>
+        </w:rPr>
+        <w:t xml:space="preserve">Field Programable Gate Array. Es un circuito integrado cuyas compuertas </w:t>
+      </w:r>
+      <w:r>
+        <w:rPr>
+          <w:rFonts w:ascii="Arial" w:hAnsi="Arial" w:cs="Arial"/>
+          <w:b/>
+          <w:bCs/>
           <w:sz w:val="20"/>
           <w:szCs w:val="20"/>
           <w:lang w:eastAsia="en-US"/>
@@ -1042,6 +1648,8 @@
       <w:r>
         <w:rPr>
           <w:rFonts w:ascii="Arial" w:hAnsi="Arial" w:cs="Arial"/>
+          <w:b/>
+          <w:bCs/>
           <w:sz w:val="20"/>
           <w:szCs w:val="20"/>
           <w:lang w:eastAsia="en-US"/>
@@ -1074,60 +1682,233 @@
           <w:szCs w:val="20"/>
           <w:lang w:eastAsia="en-US"/>
         </w:rPr>
-        <w:t>Investigue cuál es el diagrama de flujo de compilacion ASIC y describa sus partes.</w:t>
-      </w:r>
-    </w:p>
-    <w:p>
-      <w:r>
+        <w:t xml:space="preserve">Investigue cuál es el diagrama de flujo de </w:t>
+      </w:r>
+      <w:proofErr w:type="spellStart"/>
+      <w:r>
+        <w:rPr>
+          <w:rFonts w:ascii="Arial" w:hAnsi="Arial" w:cs="Arial"/>
+          <w:sz w:val="20"/>
+          <w:szCs w:val="20"/>
+          <w:lang w:eastAsia="en-US"/>
+        </w:rPr>
+        <w:t>compilacion</w:t>
+      </w:r>
+      <w:proofErr w:type="spellEnd"/>
+      <w:r>
+        <w:rPr>
+          <w:rFonts w:ascii="Arial" w:hAnsi="Arial" w:cs="Arial"/>
+          <w:sz w:val="20"/>
+          <w:szCs w:val="20"/>
+          <w:lang w:eastAsia="en-US"/>
+        </w:rPr>
+        <w:t xml:space="preserve"> ASIC y describa sus partes.</w:t>
+      </w:r>
+    </w:p>
+    <w:p>
+      <w:pPr>
+        <w:rPr>
+          <w:b/>
+          <w:bCs/>
+        </w:rPr>
+      </w:pPr>
+      <w:r>
+        <w:rPr>
+          <w:b/>
+          <w:bCs/>
+        </w:rPr>
         <w:t>El proceso según es descrito de la siguiente manera: [9]</w:t>
       </w:r>
     </w:p>
     <w:p>
-      <w:r>
-        <w:t>Especificaciones y Arquitectura- Se definen todos los specs, como manejo de alimentación, desempeño deseado y limitaciones.</w:t>
-      </w:r>
-    </w:p>
-    <w:p>
-      <w:r>
+      <w:pPr>
+        <w:rPr>
+          <w:b/>
+          <w:bCs/>
+        </w:rPr>
+      </w:pPr>
+      <w:r>
+        <w:rPr>
+          <w:b/>
+          <w:bCs/>
+        </w:rPr>
+        <w:t xml:space="preserve">Especificaciones y Arquitectura- Se definen todos los </w:t>
+      </w:r>
+      <w:proofErr w:type="spellStart"/>
+      <w:r>
+        <w:rPr>
+          <w:b/>
+          <w:bCs/>
+        </w:rPr>
+        <w:t>specs</w:t>
+      </w:r>
+      <w:proofErr w:type="spellEnd"/>
+      <w:r>
+        <w:rPr>
+          <w:b/>
+          <w:bCs/>
+        </w:rPr>
+        <w:t>, como manejo de alimentación, desempeño deseado y limitaciones.</w:t>
+      </w:r>
+    </w:p>
+    <w:p>
+      <w:pPr>
+        <w:rPr>
+          <w:b/>
+          <w:bCs/>
+        </w:rPr>
+      </w:pPr>
+      <w:r>
+        <w:rPr>
+          <w:b/>
+          <w:bCs/>
+        </w:rPr>
         <w:t>Diseño RTL- Se diseña el comportamiento del chip con código sintetizable para recrear los registros y conexiones.</w:t>
       </w:r>
     </w:p>
     <w:p>
-      <w:r>
+      <w:pPr>
+        <w:rPr>
+          <w:b/>
+          <w:bCs/>
+        </w:rPr>
+      </w:pPr>
+      <w:r>
+        <w:rPr>
+          <w:b/>
+          <w:bCs/>
+        </w:rPr>
         <w:t xml:space="preserve">Verificación Funcional- </w:t>
       </w:r>
       <w:r>
-        <w:t>Toma mayor tiempo, se realizan testbenches para probar el comportamiento y checar que este de acorde a las especificaciones.</w:t>
-      </w:r>
-    </w:p>
-    <w:p>
-      <w:r>
+        <w:rPr>
+          <w:b/>
+          <w:bCs/>
+        </w:rPr>
+        <w:t xml:space="preserve">Toma mayor tiempo, se realizan </w:t>
+      </w:r>
+      <w:proofErr w:type="spellStart"/>
+      <w:r>
+        <w:rPr>
+          <w:b/>
+          <w:bCs/>
+        </w:rPr>
+        <w:t>testbenches</w:t>
+      </w:r>
+      <w:proofErr w:type="spellEnd"/>
+      <w:r>
+        <w:rPr>
+          <w:b/>
+          <w:bCs/>
+        </w:rPr>
+        <w:t xml:space="preserve"> para probar el comportamiento y checar que este de acorde a las especificaciones.</w:t>
+      </w:r>
+    </w:p>
+    <w:p>
+      <w:pPr>
+        <w:rPr>
+          <w:b/>
+          <w:bCs/>
+        </w:rPr>
+      </w:pPr>
+      <w:r>
+        <w:rPr>
+          <w:b/>
+          <w:bCs/>
+        </w:rPr>
         <w:t xml:space="preserve">Síntesis Lógica- </w:t>
       </w:r>
       <w:r>
+        <w:rPr>
+          <w:b/>
+          <w:bCs/>
+        </w:rPr>
         <w:t>Transformar el código al hardware en nivel de compuertas.</w:t>
       </w:r>
     </w:p>
     <w:p>
-      <w:r>
-        <w:t xml:space="preserve">Layout- </w:t>
-      </w:r>
-      <w:r>
-        <w:t>Se acomoda todo t</w:t>
-      </w:r>
-      <w:r>
-        <w:t>eniendo en cuenta el posicionamiento, las señales de reloj y las trazas.</w:t>
-      </w:r>
-    </w:p>
-    <w:p>
-      <w:r>
-        <w:t>Tape-Out-</w:t>
-      </w:r>
-      <w:r>
-        <w:t xml:space="preserve"> Se confirma que todo</w:t>
-      </w:r>
-      <w:r>
-        <w:t xml:space="preserve"> este bien y coincida y finalmente ya se comienza su producción.</w:t>
+      <w:pPr>
+        <w:rPr>
+          <w:b/>
+          <w:bCs/>
+        </w:rPr>
+      </w:pPr>
+      <w:proofErr w:type="spellStart"/>
+      <w:r>
+        <w:rPr>
+          <w:b/>
+          <w:bCs/>
+        </w:rPr>
+        <w:t>Layout</w:t>
+      </w:r>
+      <w:proofErr w:type="spellEnd"/>
+      <w:r>
+        <w:rPr>
+          <w:b/>
+          <w:bCs/>
+        </w:rPr>
+        <w:t xml:space="preserve">- </w:t>
+      </w:r>
+      <w:r>
+        <w:rPr>
+          <w:b/>
+          <w:bCs/>
+        </w:rPr>
+        <w:t>Se acomoda todo teniendo en cuenta el posicionamiento, las señales de reloj y las trazas.</w:t>
+      </w:r>
+    </w:p>
+    <w:p>
+      <w:pPr>
+        <w:rPr>
+          <w:b/>
+          <w:bCs/>
+        </w:rPr>
+      </w:pPr>
+      <w:r>
+        <w:rPr>
+          <w:b/>
+          <w:bCs/>
+        </w:rPr>
+        <w:t>Tape-</w:t>
+      </w:r>
+      <w:proofErr w:type="spellStart"/>
+      <w:r>
+        <w:rPr>
+          <w:b/>
+          <w:bCs/>
+        </w:rPr>
+        <w:t>Out</w:t>
+      </w:r>
+      <w:proofErr w:type="spellEnd"/>
+      <w:r>
+        <w:rPr>
+          <w:b/>
+          <w:bCs/>
+        </w:rPr>
+        <w:t>-</w:t>
+      </w:r>
+      <w:r>
+        <w:rPr>
+          <w:b/>
+          <w:bCs/>
+        </w:rPr>
+        <w:t xml:space="preserve"> Se confirma que todo </w:t>
+      </w:r>
+      <w:proofErr w:type="spellStart"/>
+      <w:r>
+        <w:rPr>
+          <w:b/>
+          <w:bCs/>
+        </w:rPr>
+        <w:t>este</w:t>
+      </w:r>
+      <w:proofErr w:type="spellEnd"/>
+      <w:r>
+        <w:rPr>
+          <w:b/>
+          <w:bCs/>
+        </w:rPr>
+        <w:t xml:space="preserve"> bien y coincida y finalmente ya se comienza su producción.</w:t>
       </w:r>
     </w:p>
     <w:p/>
@@ -1159,46 +1940,130 @@
       <w:pPr>
         <w:rPr>
           <w:rFonts w:ascii="Arial" w:hAnsi="Arial" w:cs="Arial"/>
-          <w:sz w:val="20"/>
-          <w:szCs w:val="20"/>
-          <w:lang w:eastAsia="en-US"/>
-        </w:rPr>
-      </w:pPr>
-      <w:r>
-        <w:rPr>
-          <w:rFonts w:ascii="Arial" w:hAnsi="Arial" w:cs="Arial"/>
-          <w:sz w:val="20"/>
-          <w:szCs w:val="20"/>
-          <w:lang w:val="en-US" w:eastAsia="en-US"/>
-        </w:rPr>
-        <w:t xml:space="preserve">Joint Test Action Group. </w:t>
-      </w:r>
-      <w:r>
-        <w:rPr>
-          <w:rFonts w:ascii="Arial" w:hAnsi="Arial" w:cs="Arial"/>
-          <w:sz w:val="20"/>
-          <w:szCs w:val="20"/>
-          <w:lang w:eastAsia="en-US"/>
-        </w:rPr>
-        <w:t xml:space="preserve">Permite probar la PCBs </w:t>
-      </w:r>
-      <w:r>
-        <w:rPr>
-          <w:rFonts w:ascii="Arial" w:hAnsi="Arial" w:cs="Arial"/>
-          <w:sz w:val="20"/>
-          <w:szCs w:val="20"/>
-          <w:lang w:eastAsia="en-US"/>
-        </w:rPr>
-        <w:t xml:space="preserve">sin tener que conectarse a cada señal físicamente para mejorar el alcance de las pruebas y su eficacia. </w:t>
-      </w:r>
-      <w:r>
-        <w:rPr>
-          <w:rFonts w:ascii="Arial" w:hAnsi="Arial" w:cs="Arial"/>
-          <w:sz w:val="20"/>
-          <w:szCs w:val="20"/>
-          <w:lang w:eastAsia="en-US"/>
-        </w:rPr>
-        <w:t>El Boundary Scan Register son celdas que len y controlan el estado de los pines para hacer las pruebas. [10]</w:t>
+          <w:b/>
+          <w:bCs/>
+          <w:sz w:val="20"/>
+          <w:szCs w:val="20"/>
+          <w:lang w:eastAsia="en-US"/>
+        </w:rPr>
+      </w:pPr>
+      <w:r>
+        <w:rPr>
+          <w:rFonts w:ascii="Arial" w:hAnsi="Arial" w:cs="Arial"/>
+          <w:b/>
+          <w:bCs/>
+          <w:sz w:val="20"/>
+          <w:szCs w:val="20"/>
+          <w:lang w:eastAsia="en-US"/>
+        </w:rPr>
+        <w:t xml:space="preserve">Joint Test </w:t>
+      </w:r>
+      <w:proofErr w:type="spellStart"/>
+      <w:r>
+        <w:rPr>
+          <w:rFonts w:ascii="Arial" w:hAnsi="Arial" w:cs="Arial"/>
+          <w:b/>
+          <w:bCs/>
+          <w:sz w:val="20"/>
+          <w:szCs w:val="20"/>
+          <w:lang w:eastAsia="en-US"/>
+        </w:rPr>
+        <w:t>Action</w:t>
+      </w:r>
+      <w:proofErr w:type="spellEnd"/>
+      <w:r>
+        <w:rPr>
+          <w:rFonts w:ascii="Arial" w:hAnsi="Arial" w:cs="Arial"/>
+          <w:b/>
+          <w:bCs/>
+          <w:sz w:val="20"/>
+          <w:szCs w:val="20"/>
+          <w:lang w:eastAsia="en-US"/>
+        </w:rPr>
+        <w:t xml:space="preserve"> Group. Permite probar la </w:t>
+      </w:r>
+      <w:proofErr w:type="spellStart"/>
+      <w:r>
+        <w:rPr>
+          <w:rFonts w:ascii="Arial" w:hAnsi="Arial" w:cs="Arial"/>
+          <w:b/>
+          <w:bCs/>
+          <w:sz w:val="20"/>
+          <w:szCs w:val="20"/>
+          <w:lang w:eastAsia="en-US"/>
+        </w:rPr>
+        <w:t>PCBs</w:t>
+      </w:r>
+      <w:proofErr w:type="spellEnd"/>
+      <w:r>
+        <w:rPr>
+          <w:rFonts w:ascii="Arial" w:hAnsi="Arial" w:cs="Arial"/>
+          <w:b/>
+          <w:bCs/>
+          <w:sz w:val="20"/>
+          <w:szCs w:val="20"/>
+          <w:lang w:eastAsia="en-US"/>
+        </w:rPr>
+        <w:t xml:space="preserve"> sin tener que conectarse a cada señal físicamente para mejorar el alcance de las pruebas y su eficacia. </w:t>
+      </w:r>
+      <w:r>
+        <w:rPr>
+          <w:rFonts w:ascii="Arial" w:hAnsi="Arial" w:cs="Arial"/>
+          <w:b/>
+          <w:bCs/>
+          <w:sz w:val="20"/>
+          <w:szCs w:val="20"/>
+          <w:lang w:eastAsia="en-US"/>
+        </w:rPr>
+        <w:t xml:space="preserve">El </w:t>
+      </w:r>
+      <w:proofErr w:type="spellStart"/>
+      <w:r>
+        <w:rPr>
+          <w:rFonts w:ascii="Arial" w:hAnsi="Arial" w:cs="Arial"/>
+          <w:b/>
+          <w:bCs/>
+          <w:sz w:val="20"/>
+          <w:szCs w:val="20"/>
+          <w:lang w:eastAsia="en-US"/>
+        </w:rPr>
+        <w:t>Boundary</w:t>
+      </w:r>
+      <w:proofErr w:type="spellEnd"/>
+      <w:r>
+        <w:rPr>
+          <w:rFonts w:ascii="Arial" w:hAnsi="Arial" w:cs="Arial"/>
+          <w:b/>
+          <w:bCs/>
+          <w:sz w:val="20"/>
+          <w:szCs w:val="20"/>
+          <w:lang w:eastAsia="en-US"/>
+        </w:rPr>
+        <w:t xml:space="preserve"> Scan Register son celdas que </w:t>
+      </w:r>
+      <w:proofErr w:type="spellStart"/>
+      <w:r>
+        <w:rPr>
+          <w:rFonts w:ascii="Arial" w:hAnsi="Arial" w:cs="Arial"/>
+          <w:b/>
+          <w:bCs/>
+          <w:sz w:val="20"/>
+          <w:szCs w:val="20"/>
+          <w:lang w:eastAsia="en-US"/>
+        </w:rPr>
+        <w:t>len</w:t>
+      </w:r>
+      <w:proofErr w:type="spellEnd"/>
+      <w:r>
+        <w:rPr>
+          <w:rFonts w:ascii="Arial" w:hAnsi="Arial" w:cs="Arial"/>
+          <w:b/>
+          <w:bCs/>
+          <w:sz w:val="20"/>
+          <w:szCs w:val="20"/>
+          <w:lang w:eastAsia="en-US"/>
+        </w:rPr>
+        <w:t xml:space="preserve"> y controlan el estado de los pines para hacer las pruebas. [10]</w:t>
       </w:r>
     </w:p>
     <w:p>
@@ -1232,21 +2097,45 @@
           <w:szCs w:val="20"/>
           <w:lang w:eastAsia="en-US"/>
         </w:rPr>
-        <w:t>¿Qué es un circuito asincrono?</w:t>
-      </w:r>
-    </w:p>
-    <w:p>
-      <w:pPr>
-        <w:rPr>
-          <w:rFonts w:ascii="Arial" w:hAnsi="Arial" w:cs="Arial"/>
-          <w:sz w:val="20"/>
-          <w:szCs w:val="20"/>
-          <w:lang w:eastAsia="en-US"/>
-        </w:rPr>
-      </w:pPr>
-      <w:r>
-        <w:rPr>
-          <w:rFonts w:ascii="Arial" w:hAnsi="Arial" w:cs="Arial"/>
+        <w:t xml:space="preserve">¿Qué es un circuito </w:t>
+      </w:r>
+      <w:proofErr w:type="spellStart"/>
+      <w:r>
+        <w:rPr>
+          <w:rFonts w:ascii="Arial" w:hAnsi="Arial" w:cs="Arial"/>
+          <w:sz w:val="20"/>
+          <w:szCs w:val="20"/>
+          <w:lang w:eastAsia="en-US"/>
+        </w:rPr>
+        <w:t>asincrono</w:t>
+      </w:r>
+      <w:proofErr w:type="spellEnd"/>
+      <w:r>
+        <w:rPr>
+          <w:rFonts w:ascii="Arial" w:hAnsi="Arial" w:cs="Arial"/>
+          <w:sz w:val="20"/>
+          <w:szCs w:val="20"/>
+          <w:lang w:eastAsia="en-US"/>
+        </w:rPr>
+        <w:t>?</w:t>
+      </w:r>
+    </w:p>
+    <w:p>
+      <w:pPr>
+        <w:rPr>
+          <w:rFonts w:ascii="Arial" w:hAnsi="Arial" w:cs="Arial"/>
+          <w:b/>
+          <w:bCs/>
+          <w:sz w:val="20"/>
+          <w:szCs w:val="20"/>
+          <w:lang w:eastAsia="en-US"/>
+        </w:rPr>
+      </w:pPr>
+      <w:r>
+        <w:rPr>
+          <w:rFonts w:ascii="Arial" w:hAnsi="Arial" w:cs="Arial"/>
+          <w:b/>
+          <w:bCs/>
           <w:sz w:val="20"/>
           <w:szCs w:val="20"/>
           <w:lang w:eastAsia="en-US"/>
@@ -1258,6 +2147,8 @@
       <w:pPr>
         <w:rPr>
           <w:rFonts w:ascii="Arial" w:hAnsi="Arial" w:cs="Arial"/>
+          <w:b/>
+          <w:bCs/>
           <w:sz w:val="20"/>
           <w:szCs w:val="20"/>
           <w:lang w:eastAsia="en-US"/>
@@ -1285,21 +2176,45 @@
           <w:szCs w:val="20"/>
           <w:lang w:eastAsia="en-US"/>
         </w:rPr>
-        <w:t>¿Qué es un circuito sincrono?</w:t>
-      </w:r>
-    </w:p>
-    <w:p>
-      <w:pPr>
-        <w:rPr>
-          <w:rFonts w:ascii="Arial" w:hAnsi="Arial" w:cs="Arial"/>
-          <w:sz w:val="20"/>
-          <w:szCs w:val="20"/>
-          <w:lang w:eastAsia="en-US"/>
-        </w:rPr>
-      </w:pPr>
-      <w:r>
-        <w:rPr>
-          <w:rFonts w:ascii="Arial" w:hAnsi="Arial" w:cs="Arial"/>
+        <w:t xml:space="preserve">¿Qué es un circuito </w:t>
+      </w:r>
+      <w:proofErr w:type="spellStart"/>
+      <w:r>
+        <w:rPr>
+          <w:rFonts w:ascii="Arial" w:hAnsi="Arial" w:cs="Arial"/>
+          <w:sz w:val="20"/>
+          <w:szCs w:val="20"/>
+          <w:lang w:eastAsia="en-US"/>
+        </w:rPr>
+        <w:t>sincrono</w:t>
+      </w:r>
+      <w:proofErr w:type="spellEnd"/>
+      <w:r>
+        <w:rPr>
+          <w:rFonts w:ascii="Arial" w:hAnsi="Arial" w:cs="Arial"/>
+          <w:sz w:val="20"/>
+          <w:szCs w:val="20"/>
+          <w:lang w:eastAsia="en-US"/>
+        </w:rPr>
+        <w:t>?</w:t>
+      </w:r>
+    </w:p>
+    <w:p>
+      <w:pPr>
+        <w:rPr>
+          <w:rFonts w:ascii="Arial" w:hAnsi="Arial" w:cs="Arial"/>
+          <w:b/>
+          <w:bCs/>
+          <w:sz w:val="20"/>
+          <w:szCs w:val="20"/>
+          <w:lang w:eastAsia="en-US"/>
+        </w:rPr>
+      </w:pPr>
+      <w:r>
+        <w:rPr>
+          <w:rFonts w:ascii="Arial" w:hAnsi="Arial" w:cs="Arial"/>
+          <w:b/>
+          <w:bCs/>
           <w:sz w:val="20"/>
           <w:szCs w:val="20"/>
           <w:lang w:eastAsia="en-US"/>
@@ -1338,16 +2253,56 @@
           <w:szCs w:val="20"/>
           <w:lang w:eastAsia="en-US"/>
         </w:rPr>
-        <w:t>¿Qué es el setup time</w:t>
-      </w:r>
-      <w:r>
-        <w:rPr>
-          <w:rFonts w:ascii="Arial" w:hAnsi="Arial" w:cs="Arial"/>
-          <w:sz w:val="20"/>
-          <w:szCs w:val="20"/>
-          <w:lang w:eastAsia="en-US"/>
-        </w:rPr>
-        <w:t xml:space="preserve"> y el hold time</w:t>
+        <w:t xml:space="preserve">¿Qué es el </w:t>
+      </w:r>
+      <w:proofErr w:type="spellStart"/>
+      <w:r>
+        <w:rPr>
+          <w:rFonts w:ascii="Arial" w:hAnsi="Arial" w:cs="Arial"/>
+          <w:sz w:val="20"/>
+          <w:szCs w:val="20"/>
+          <w:lang w:eastAsia="en-US"/>
+        </w:rPr>
+        <w:t>setup</w:t>
+      </w:r>
+      <w:proofErr w:type="spellEnd"/>
+      <w:r>
+        <w:rPr>
+          <w:rFonts w:ascii="Arial" w:hAnsi="Arial" w:cs="Arial"/>
+          <w:sz w:val="20"/>
+          <w:szCs w:val="20"/>
+          <w:lang w:eastAsia="en-US"/>
+        </w:rPr>
+        <w:t xml:space="preserve"> time</w:t>
+      </w:r>
+      <w:r>
+        <w:rPr>
+          <w:rFonts w:ascii="Arial" w:hAnsi="Arial" w:cs="Arial"/>
+          <w:sz w:val="20"/>
+          <w:szCs w:val="20"/>
+          <w:lang w:eastAsia="en-US"/>
+        </w:rPr>
+        <w:t xml:space="preserve"> y el </w:t>
+      </w:r>
+      <w:proofErr w:type="spellStart"/>
+      <w:r>
+        <w:rPr>
+          <w:rFonts w:ascii="Arial" w:hAnsi="Arial" w:cs="Arial"/>
+          <w:sz w:val="20"/>
+          <w:szCs w:val="20"/>
+          <w:lang w:eastAsia="en-US"/>
+        </w:rPr>
+        <w:t>hold</w:t>
+      </w:r>
+      <w:proofErr w:type="spellEnd"/>
+      <w:r>
+        <w:rPr>
+          <w:rFonts w:ascii="Arial" w:hAnsi="Arial" w:cs="Arial"/>
+          <w:sz w:val="20"/>
+          <w:szCs w:val="20"/>
+          <w:lang w:eastAsia="en-US"/>
+        </w:rPr>
+        <w:t xml:space="preserve"> time</w:t>
       </w:r>
       <w:r>
         <w:rPr>
@@ -1363,23 +2318,42 @@
       <w:pPr>
         <w:rPr>
           <w:rFonts w:ascii="Arial" w:hAnsi="Arial" w:cs="Arial"/>
-          <w:sz w:val="20"/>
-          <w:szCs w:val="20"/>
-          <w:lang w:eastAsia="en-US"/>
-        </w:rPr>
-      </w:pPr>
-      <w:r>
-        <w:rPr>
-          <w:rFonts w:ascii="Arial" w:hAnsi="Arial" w:cs="Arial"/>
-          <w:sz w:val="20"/>
-          <w:szCs w:val="20"/>
-          <w:lang w:eastAsia="en-US"/>
-        </w:rPr>
-        <w:t>Setup time es el tiempo</w:t>
-      </w:r>
-      <w:r>
-        <w:rPr>
-          <w:rFonts w:ascii="Arial" w:hAnsi="Arial" w:cs="Arial"/>
+          <w:b/>
+          <w:bCs/>
+          <w:sz w:val="20"/>
+          <w:szCs w:val="20"/>
+          <w:lang w:eastAsia="en-US"/>
+        </w:rPr>
+      </w:pPr>
+      <w:proofErr w:type="spellStart"/>
+      <w:r>
+        <w:rPr>
+          <w:rFonts w:ascii="Arial" w:hAnsi="Arial" w:cs="Arial"/>
+          <w:b/>
+          <w:bCs/>
+          <w:sz w:val="20"/>
+          <w:szCs w:val="20"/>
+          <w:lang w:eastAsia="en-US"/>
+        </w:rPr>
+        <w:t>Setup</w:t>
+      </w:r>
+      <w:proofErr w:type="spellEnd"/>
+      <w:r>
+        <w:rPr>
+          <w:rFonts w:ascii="Arial" w:hAnsi="Arial" w:cs="Arial"/>
+          <w:b/>
+          <w:bCs/>
+          <w:sz w:val="20"/>
+          <w:szCs w:val="20"/>
+          <w:lang w:eastAsia="en-US"/>
+        </w:rPr>
+        <w:t xml:space="preserve"> time es el tiempo</w:t>
+      </w:r>
+      <w:r>
+        <w:rPr>
+          <w:rFonts w:ascii="Arial" w:hAnsi="Arial" w:cs="Arial"/>
+          <w:b/>
+          <w:bCs/>
           <w:sz w:val="20"/>
           <w:szCs w:val="20"/>
           <w:lang w:eastAsia="en-US"/>
@@ -1389,6 +2363,8 @@
       <w:r>
         <w:rPr>
           <w:rFonts w:ascii="Arial" w:hAnsi="Arial" w:cs="Arial"/>
+          <w:b/>
+          <w:bCs/>
           <w:sz w:val="20"/>
           <w:szCs w:val="20"/>
           <w:lang w:eastAsia="en-US"/>
@@ -1398,6 +2374,8 @@
       <w:r>
         <w:rPr>
           <w:rFonts w:ascii="Arial" w:hAnsi="Arial" w:cs="Arial"/>
+          <w:b/>
+          <w:bCs/>
           <w:sz w:val="20"/>
           <w:szCs w:val="20"/>
           <w:lang w:eastAsia="en-US"/>
@@ -1407,6 +2385,8 @@
       <w:r>
         <w:rPr>
           <w:rFonts w:ascii="Arial" w:hAnsi="Arial" w:cs="Arial"/>
+          <w:b/>
+          <w:bCs/>
           <w:sz w:val="20"/>
           <w:szCs w:val="20"/>
           <w:lang w:eastAsia="en-US"/>
@@ -1416,6 +2396,8 @@
       <w:r>
         <w:rPr>
           <w:rFonts w:ascii="Arial" w:hAnsi="Arial" w:cs="Arial"/>
+          <w:b/>
+          <w:bCs/>
           <w:sz w:val="20"/>
           <w:szCs w:val="20"/>
           <w:lang w:eastAsia="en-US"/>
@@ -1454,6 +2436,7 @@
           <w:szCs w:val="20"/>
           <w:lang w:eastAsia="en-US"/>
         </w:rPr>
+        <w:lastRenderedPageBreak/>
         <w:t>¿</w:t>
       </w:r>
       <w:r>
@@ -1463,8 +2446,19 @@
           <w:szCs w:val="20"/>
           <w:lang w:eastAsia="en-US"/>
         </w:rPr>
-        <w:t>Qué es una lista de sensibilidad en Verilog</w:t>
-      </w:r>
+        <w:t xml:space="preserve">Qué es una lista de sensibilidad en </w:t>
+      </w:r>
+      <w:proofErr w:type="spellStart"/>
+      <w:r>
+        <w:rPr>
+          <w:rFonts w:ascii="Arial" w:hAnsi="Arial" w:cs="Arial"/>
+          <w:sz w:val="20"/>
+          <w:szCs w:val="20"/>
+          <w:lang w:eastAsia="en-US"/>
+        </w:rPr>
+        <w:t>Verilog</w:t>
+      </w:r>
+      <w:proofErr w:type="spellEnd"/>
       <w:r>
         <w:rPr>
           <w:rFonts w:ascii="Arial" w:hAnsi="Arial" w:cs="Arial"/>
@@ -1479,20 +2473,47 @@
       <w:pPr>
         <w:rPr>
           <w:rFonts w:ascii="Arial" w:hAnsi="Arial" w:cs="Arial"/>
-          <w:sz w:val="20"/>
-          <w:szCs w:val="20"/>
-          <w:lang w:eastAsia="en-US"/>
-        </w:rPr>
-      </w:pPr>
-      <w:r>
-        <w:rPr>
-          <w:rFonts w:ascii="Arial" w:hAnsi="Arial" w:cs="Arial"/>
-          <w:sz w:val="20"/>
-          <w:szCs w:val="20"/>
-          <w:lang w:eastAsia="en-US"/>
-        </w:rPr>
-        <w:lastRenderedPageBreak/>
-        <w:t>Son las variables o señales de las cuales está pendiente el always.</w:t>
+          <w:b/>
+          <w:bCs/>
+          <w:sz w:val="20"/>
+          <w:szCs w:val="20"/>
+          <w:lang w:eastAsia="en-US"/>
+        </w:rPr>
+      </w:pPr>
+      <w:r>
+        <w:rPr>
+          <w:rFonts w:ascii="Arial" w:hAnsi="Arial" w:cs="Arial"/>
+          <w:b/>
+          <w:bCs/>
+          <w:sz w:val="20"/>
+          <w:szCs w:val="20"/>
+          <w:lang w:eastAsia="en-US"/>
+        </w:rPr>
+        <w:t xml:space="preserve">Son las variables o señales de las cuales está pendiente el </w:t>
+      </w:r>
+      <w:proofErr w:type="spellStart"/>
+      <w:r>
+        <w:rPr>
+          <w:rFonts w:ascii="Arial" w:hAnsi="Arial" w:cs="Arial"/>
+          <w:b/>
+          <w:bCs/>
+          <w:sz w:val="20"/>
+          <w:szCs w:val="20"/>
+          <w:lang w:eastAsia="en-US"/>
+        </w:rPr>
+        <w:t>always</w:t>
+      </w:r>
+      <w:proofErr w:type="spellEnd"/>
+      <w:r>
+        <w:rPr>
+          <w:rFonts w:ascii="Arial" w:hAnsi="Arial" w:cs="Arial"/>
+          <w:b/>
+          <w:bCs/>
+          <w:sz w:val="20"/>
+          <w:szCs w:val="20"/>
+          <w:lang w:eastAsia="en-US"/>
+        </w:rPr>
+        <w:t>.</w:t>
       </w:r>
     </w:p>
     <w:p>
@@ -1526,26 +2547,98 @@
           <w:szCs w:val="20"/>
           <w:lang w:eastAsia="en-US"/>
         </w:rPr>
-        <w:t>¿Qué es un latch?</w:t>
-      </w:r>
-    </w:p>
-    <w:p>
-      <w:pPr>
-        <w:rPr>
-          <w:rFonts w:ascii="Arial" w:hAnsi="Arial" w:cs="Arial"/>
-          <w:sz w:val="20"/>
-          <w:szCs w:val="20"/>
-          <w:lang w:eastAsia="en-US"/>
-        </w:rPr>
-      </w:pPr>
-      <w:r>
-        <w:rPr>
-          <w:rFonts w:ascii="Arial" w:hAnsi="Arial" w:cs="Arial"/>
-          <w:sz w:val="20"/>
-          <w:szCs w:val="20"/>
-          <w:lang w:eastAsia="en-US"/>
-        </w:rPr>
-        <w:t>Es un elemento que almacena un valor 0-1 que depende del enable y no del clock. [12]</w:t>
+        <w:t xml:space="preserve">¿Qué es un </w:t>
+      </w:r>
+      <w:proofErr w:type="spellStart"/>
+      <w:r>
+        <w:rPr>
+          <w:rFonts w:ascii="Arial" w:hAnsi="Arial" w:cs="Arial"/>
+          <w:sz w:val="20"/>
+          <w:szCs w:val="20"/>
+          <w:lang w:eastAsia="en-US"/>
+        </w:rPr>
+        <w:t>latch</w:t>
+      </w:r>
+      <w:proofErr w:type="spellEnd"/>
+      <w:r>
+        <w:rPr>
+          <w:rFonts w:ascii="Arial" w:hAnsi="Arial" w:cs="Arial"/>
+          <w:sz w:val="20"/>
+          <w:szCs w:val="20"/>
+          <w:lang w:eastAsia="en-US"/>
+        </w:rPr>
+        <w:t>?</w:t>
+      </w:r>
+    </w:p>
+    <w:p>
+      <w:pPr>
+        <w:rPr>
+          <w:rFonts w:ascii="Arial" w:hAnsi="Arial" w:cs="Arial"/>
+          <w:b/>
+          <w:bCs/>
+          <w:sz w:val="20"/>
+          <w:szCs w:val="20"/>
+          <w:lang w:eastAsia="en-US"/>
+        </w:rPr>
+      </w:pPr>
+      <w:r>
+        <w:rPr>
+          <w:rFonts w:ascii="Arial" w:hAnsi="Arial" w:cs="Arial"/>
+          <w:b/>
+          <w:bCs/>
+          <w:sz w:val="20"/>
+          <w:szCs w:val="20"/>
+          <w:lang w:eastAsia="en-US"/>
+        </w:rPr>
+        <w:t xml:space="preserve">Es un elemento que almacena un valor 0-1 que depende del </w:t>
+      </w:r>
+      <w:proofErr w:type="spellStart"/>
+      <w:r>
+        <w:rPr>
+          <w:rFonts w:ascii="Arial" w:hAnsi="Arial" w:cs="Arial"/>
+          <w:b/>
+          <w:bCs/>
+          <w:sz w:val="20"/>
+          <w:szCs w:val="20"/>
+          <w:lang w:eastAsia="en-US"/>
+        </w:rPr>
+        <w:t>enable</w:t>
+      </w:r>
+      <w:proofErr w:type="spellEnd"/>
+      <w:r>
+        <w:rPr>
+          <w:rFonts w:ascii="Arial" w:hAnsi="Arial" w:cs="Arial"/>
+          <w:b/>
+          <w:bCs/>
+          <w:sz w:val="20"/>
+          <w:szCs w:val="20"/>
+          <w:lang w:eastAsia="en-US"/>
+        </w:rPr>
+        <w:t xml:space="preserve"> y no del </w:t>
+      </w:r>
+      <w:proofErr w:type="spellStart"/>
+      <w:r>
+        <w:rPr>
+          <w:rFonts w:ascii="Arial" w:hAnsi="Arial" w:cs="Arial"/>
+          <w:b/>
+          <w:bCs/>
+          <w:sz w:val="20"/>
+          <w:szCs w:val="20"/>
+          <w:lang w:eastAsia="en-US"/>
+        </w:rPr>
+        <w:t>clock</w:t>
+      </w:r>
+      <w:proofErr w:type="spellEnd"/>
+      <w:r>
+        <w:rPr>
+          <w:rFonts w:ascii="Arial" w:hAnsi="Arial" w:cs="Arial"/>
+          <w:b/>
+          <w:bCs/>
+          <w:sz w:val="20"/>
+          <w:szCs w:val="20"/>
+          <w:lang w:eastAsia="en-US"/>
+        </w:rPr>
+        <w:t>. [12]</w:t>
       </w:r>
     </w:p>
     <w:p>
@@ -1579,26 +2672,166 @@
           <w:szCs w:val="20"/>
           <w:lang w:eastAsia="en-US"/>
         </w:rPr>
-        <w:t>¿Cuál es la diferencia entre un latch y un flip-flop?</w:t>
-      </w:r>
-    </w:p>
-    <w:p>
-      <w:pPr>
-        <w:rPr>
-          <w:rFonts w:ascii="Arial" w:hAnsi="Arial" w:cs="Arial"/>
-          <w:sz w:val="20"/>
-          <w:szCs w:val="20"/>
-          <w:lang w:eastAsia="en-US"/>
-        </w:rPr>
-      </w:pPr>
-      <w:r>
-        <w:rPr>
-          <w:rFonts w:ascii="Arial" w:hAnsi="Arial" w:cs="Arial"/>
-          <w:sz w:val="20"/>
-          <w:szCs w:val="20"/>
-          <w:lang w:eastAsia="en-US"/>
-        </w:rPr>
-        <w:t>El latch cambia de estado con el enable y el flip’flop depende de la señal de clock. [12]</w:t>
+        <w:t xml:space="preserve">¿Cuál es la diferencia entre un </w:t>
+      </w:r>
+      <w:proofErr w:type="spellStart"/>
+      <w:r>
+        <w:rPr>
+          <w:rFonts w:ascii="Arial" w:hAnsi="Arial" w:cs="Arial"/>
+          <w:sz w:val="20"/>
+          <w:szCs w:val="20"/>
+          <w:lang w:eastAsia="en-US"/>
+        </w:rPr>
+        <w:t>latch</w:t>
+      </w:r>
+      <w:proofErr w:type="spellEnd"/>
+      <w:r>
+        <w:rPr>
+          <w:rFonts w:ascii="Arial" w:hAnsi="Arial" w:cs="Arial"/>
+          <w:sz w:val="20"/>
+          <w:szCs w:val="20"/>
+          <w:lang w:eastAsia="en-US"/>
+        </w:rPr>
+        <w:t xml:space="preserve"> y un </w:t>
+      </w:r>
+      <w:proofErr w:type="spellStart"/>
+      <w:r>
+        <w:rPr>
+          <w:rFonts w:ascii="Arial" w:hAnsi="Arial" w:cs="Arial"/>
+          <w:sz w:val="20"/>
+          <w:szCs w:val="20"/>
+          <w:lang w:eastAsia="en-US"/>
+        </w:rPr>
+        <w:t>flip-flop</w:t>
+      </w:r>
+      <w:proofErr w:type="spellEnd"/>
+      <w:r>
+        <w:rPr>
+          <w:rFonts w:ascii="Arial" w:hAnsi="Arial" w:cs="Arial"/>
+          <w:sz w:val="20"/>
+          <w:szCs w:val="20"/>
+          <w:lang w:eastAsia="en-US"/>
+        </w:rPr>
+        <w:t>?</w:t>
+      </w:r>
+    </w:p>
+    <w:p>
+      <w:pPr>
+        <w:rPr>
+          <w:rFonts w:ascii="Arial" w:hAnsi="Arial" w:cs="Arial"/>
+          <w:b/>
+          <w:bCs/>
+          <w:sz w:val="20"/>
+          <w:szCs w:val="20"/>
+          <w:lang w:eastAsia="en-US"/>
+        </w:rPr>
+      </w:pPr>
+      <w:r>
+        <w:rPr>
+          <w:rFonts w:ascii="Arial" w:hAnsi="Arial" w:cs="Arial"/>
+          <w:b/>
+          <w:bCs/>
+          <w:sz w:val="20"/>
+          <w:szCs w:val="20"/>
+          <w:lang w:eastAsia="en-US"/>
+        </w:rPr>
+        <w:t xml:space="preserve">El </w:t>
+      </w:r>
+      <w:proofErr w:type="spellStart"/>
+      <w:r>
+        <w:rPr>
+          <w:rFonts w:ascii="Arial" w:hAnsi="Arial" w:cs="Arial"/>
+          <w:b/>
+          <w:bCs/>
+          <w:sz w:val="20"/>
+          <w:szCs w:val="20"/>
+          <w:lang w:eastAsia="en-US"/>
+        </w:rPr>
+        <w:t>latch</w:t>
+      </w:r>
+      <w:proofErr w:type="spellEnd"/>
+      <w:r>
+        <w:rPr>
+          <w:rFonts w:ascii="Arial" w:hAnsi="Arial" w:cs="Arial"/>
+          <w:b/>
+          <w:bCs/>
+          <w:sz w:val="20"/>
+          <w:szCs w:val="20"/>
+          <w:lang w:eastAsia="en-US"/>
+        </w:rPr>
+        <w:t xml:space="preserve"> cambia de estado con el </w:t>
+      </w:r>
+      <w:proofErr w:type="spellStart"/>
+      <w:r>
+        <w:rPr>
+          <w:rFonts w:ascii="Arial" w:hAnsi="Arial" w:cs="Arial"/>
+          <w:b/>
+          <w:bCs/>
+          <w:sz w:val="20"/>
+          <w:szCs w:val="20"/>
+          <w:lang w:eastAsia="en-US"/>
+        </w:rPr>
+        <w:t>enable</w:t>
+      </w:r>
+      <w:proofErr w:type="spellEnd"/>
+      <w:r>
+        <w:rPr>
+          <w:rFonts w:ascii="Arial" w:hAnsi="Arial" w:cs="Arial"/>
+          <w:b/>
+          <w:bCs/>
+          <w:sz w:val="20"/>
+          <w:szCs w:val="20"/>
+          <w:lang w:eastAsia="en-US"/>
+        </w:rPr>
+        <w:t xml:space="preserve"> y el </w:t>
+      </w:r>
+      <w:proofErr w:type="spellStart"/>
+      <w:r>
+        <w:rPr>
+          <w:rFonts w:ascii="Arial" w:hAnsi="Arial" w:cs="Arial"/>
+          <w:b/>
+          <w:bCs/>
+          <w:sz w:val="20"/>
+          <w:szCs w:val="20"/>
+          <w:lang w:eastAsia="en-US"/>
+        </w:rPr>
+        <w:t>flip’flop</w:t>
+      </w:r>
+      <w:proofErr w:type="spellEnd"/>
+      <w:r>
+        <w:rPr>
+          <w:rFonts w:ascii="Arial" w:hAnsi="Arial" w:cs="Arial"/>
+          <w:b/>
+          <w:bCs/>
+          <w:sz w:val="20"/>
+          <w:szCs w:val="20"/>
+          <w:lang w:eastAsia="en-US"/>
+        </w:rPr>
+        <w:t xml:space="preserve"> depende de la señal de </w:t>
+      </w:r>
+      <w:proofErr w:type="spellStart"/>
+      <w:r>
+        <w:rPr>
+          <w:rFonts w:ascii="Arial" w:hAnsi="Arial" w:cs="Arial"/>
+          <w:b/>
+          <w:bCs/>
+          <w:sz w:val="20"/>
+          <w:szCs w:val="20"/>
+          <w:lang w:eastAsia="en-US"/>
+        </w:rPr>
+        <w:t>clock</w:t>
+      </w:r>
+      <w:proofErr w:type="spellEnd"/>
+      <w:r>
+        <w:rPr>
+          <w:rFonts w:ascii="Arial" w:hAnsi="Arial" w:cs="Arial"/>
+          <w:b/>
+          <w:bCs/>
+          <w:sz w:val="20"/>
+          <w:szCs w:val="20"/>
+          <w:lang w:eastAsia="en-US"/>
+        </w:rPr>
+        <w:t>. [12]</w:t>
       </w:r>
     </w:p>
     <w:p>
@@ -1632,26 +2865,122 @@
           <w:szCs w:val="20"/>
           <w:lang w:eastAsia="en-US"/>
         </w:rPr>
-        <w:t>¿Qué es metastabilidad?</w:t>
-      </w:r>
-    </w:p>
-    <w:p>
-      <w:pPr>
-        <w:rPr>
-          <w:rFonts w:ascii="Arial" w:hAnsi="Arial" w:cs="Arial"/>
-          <w:sz w:val="20"/>
-          <w:szCs w:val="20"/>
-          <w:lang w:eastAsia="en-US"/>
-        </w:rPr>
-      </w:pPr>
-      <w:r>
-        <w:rPr>
-          <w:rFonts w:ascii="Arial" w:hAnsi="Arial" w:cs="Arial"/>
-          <w:sz w:val="20"/>
-          <w:szCs w:val="20"/>
-          <w:lang w:eastAsia="en-US"/>
-        </w:rPr>
-        <w:t>Es cuando un flip-flop no puede dar una salida definida y se tarda en dar la salida correcta porque se violó el setup time o el hold time. [11]</w:t>
+        <w:t xml:space="preserve">¿Qué es </w:t>
+      </w:r>
+      <w:proofErr w:type="spellStart"/>
+      <w:r>
+        <w:rPr>
+          <w:rFonts w:ascii="Arial" w:hAnsi="Arial" w:cs="Arial"/>
+          <w:sz w:val="20"/>
+          <w:szCs w:val="20"/>
+          <w:lang w:eastAsia="en-US"/>
+        </w:rPr>
+        <w:t>metastabilidad</w:t>
+      </w:r>
+      <w:proofErr w:type="spellEnd"/>
+      <w:r>
+        <w:rPr>
+          <w:rFonts w:ascii="Arial" w:hAnsi="Arial" w:cs="Arial"/>
+          <w:sz w:val="20"/>
+          <w:szCs w:val="20"/>
+          <w:lang w:eastAsia="en-US"/>
+        </w:rPr>
+        <w:t>?</w:t>
+      </w:r>
+    </w:p>
+    <w:p>
+      <w:pPr>
+        <w:rPr>
+          <w:rFonts w:ascii="Arial" w:hAnsi="Arial" w:cs="Arial"/>
+          <w:b/>
+          <w:bCs/>
+          <w:sz w:val="20"/>
+          <w:szCs w:val="20"/>
+          <w:lang w:eastAsia="en-US"/>
+        </w:rPr>
+      </w:pPr>
+      <w:r>
+        <w:rPr>
+          <w:rFonts w:ascii="Arial" w:hAnsi="Arial" w:cs="Arial"/>
+          <w:b/>
+          <w:bCs/>
+          <w:sz w:val="20"/>
+          <w:szCs w:val="20"/>
+          <w:lang w:eastAsia="en-US"/>
+        </w:rPr>
+        <w:t xml:space="preserve">Es cuando un </w:t>
+      </w:r>
+      <w:proofErr w:type="spellStart"/>
+      <w:r>
+        <w:rPr>
+          <w:rFonts w:ascii="Arial" w:hAnsi="Arial" w:cs="Arial"/>
+          <w:b/>
+          <w:bCs/>
+          <w:sz w:val="20"/>
+          <w:szCs w:val="20"/>
+          <w:lang w:eastAsia="en-US"/>
+        </w:rPr>
+        <w:t>flip-flop</w:t>
+      </w:r>
+      <w:proofErr w:type="spellEnd"/>
+      <w:r>
+        <w:rPr>
+          <w:rFonts w:ascii="Arial" w:hAnsi="Arial" w:cs="Arial"/>
+          <w:b/>
+          <w:bCs/>
+          <w:sz w:val="20"/>
+          <w:szCs w:val="20"/>
+          <w:lang w:eastAsia="en-US"/>
+        </w:rPr>
+        <w:t xml:space="preserve"> no puede dar una salida definida y se tarda en dar la salida correcta porque se violó el </w:t>
+      </w:r>
+      <w:proofErr w:type="spellStart"/>
+      <w:r>
+        <w:rPr>
+          <w:rFonts w:ascii="Arial" w:hAnsi="Arial" w:cs="Arial"/>
+          <w:b/>
+          <w:bCs/>
+          <w:sz w:val="20"/>
+          <w:szCs w:val="20"/>
+          <w:lang w:eastAsia="en-US"/>
+        </w:rPr>
+        <w:t>setup</w:t>
+      </w:r>
+      <w:proofErr w:type="spellEnd"/>
+      <w:r>
+        <w:rPr>
+          <w:rFonts w:ascii="Arial" w:hAnsi="Arial" w:cs="Arial"/>
+          <w:b/>
+          <w:bCs/>
+          <w:sz w:val="20"/>
+          <w:szCs w:val="20"/>
+          <w:lang w:eastAsia="en-US"/>
+        </w:rPr>
+        <w:t xml:space="preserve"> time o el </w:t>
+      </w:r>
+      <w:proofErr w:type="spellStart"/>
+      <w:r>
+        <w:rPr>
+          <w:rFonts w:ascii="Arial" w:hAnsi="Arial" w:cs="Arial"/>
+          <w:b/>
+          <w:bCs/>
+          <w:sz w:val="20"/>
+          <w:szCs w:val="20"/>
+          <w:lang w:eastAsia="en-US"/>
+        </w:rPr>
+        <w:t>hold</w:t>
+      </w:r>
+      <w:proofErr w:type="spellEnd"/>
+      <w:r>
+        <w:rPr>
+          <w:rFonts w:ascii="Arial" w:hAnsi="Arial" w:cs="Arial"/>
+          <w:b/>
+          <w:bCs/>
+          <w:sz w:val="20"/>
+          <w:szCs w:val="20"/>
+          <w:lang w:eastAsia="en-US"/>
+        </w:rPr>
+        <w:t xml:space="preserve"> time. [11]</w:t>
       </w:r>
     </w:p>
     <w:p>
@@ -1703,26 +3032,98 @@
           <w:szCs w:val="20"/>
           <w:lang w:eastAsia="en-US"/>
         </w:rPr>
-        <w:t xml:space="preserve"> producir metastabilidad en un sistema digital?</w:t>
-      </w:r>
-    </w:p>
-    <w:p>
-      <w:pPr>
-        <w:rPr>
-          <w:rFonts w:ascii="Arial" w:hAnsi="Arial" w:cs="Arial"/>
-          <w:sz w:val="20"/>
-          <w:szCs w:val="20"/>
-          <w:lang w:eastAsia="en-US"/>
-        </w:rPr>
-      </w:pPr>
-      <w:r>
-        <w:rPr>
-          <w:rFonts w:ascii="Arial" w:hAnsi="Arial" w:cs="Arial"/>
-          <w:sz w:val="20"/>
-          <w:szCs w:val="20"/>
-          <w:lang w:eastAsia="en-US"/>
-        </w:rPr>
-        <w:t>Cuando no se respetan el setup time y el hold time. [11]</w:t>
+        <w:t xml:space="preserve"> producir </w:t>
+      </w:r>
+      <w:proofErr w:type="spellStart"/>
+      <w:r>
+        <w:rPr>
+          <w:rFonts w:ascii="Arial" w:hAnsi="Arial" w:cs="Arial"/>
+          <w:sz w:val="20"/>
+          <w:szCs w:val="20"/>
+          <w:lang w:eastAsia="en-US"/>
+        </w:rPr>
+        <w:t>metastabilidad</w:t>
+      </w:r>
+      <w:proofErr w:type="spellEnd"/>
+      <w:r>
+        <w:rPr>
+          <w:rFonts w:ascii="Arial" w:hAnsi="Arial" w:cs="Arial"/>
+          <w:sz w:val="20"/>
+          <w:szCs w:val="20"/>
+          <w:lang w:eastAsia="en-US"/>
+        </w:rPr>
+        <w:t xml:space="preserve"> en un sistema digital?</w:t>
+      </w:r>
+    </w:p>
+    <w:p>
+      <w:pPr>
+        <w:rPr>
+          <w:rFonts w:ascii="Arial" w:hAnsi="Arial" w:cs="Arial"/>
+          <w:b/>
+          <w:bCs/>
+          <w:sz w:val="20"/>
+          <w:szCs w:val="20"/>
+          <w:lang w:eastAsia="en-US"/>
+        </w:rPr>
+      </w:pPr>
+      <w:r>
+        <w:rPr>
+          <w:rFonts w:ascii="Arial" w:hAnsi="Arial" w:cs="Arial"/>
+          <w:b/>
+          <w:bCs/>
+          <w:sz w:val="20"/>
+          <w:szCs w:val="20"/>
+          <w:lang w:eastAsia="en-US"/>
+        </w:rPr>
+        <w:t xml:space="preserve">Cuando no se respetan el </w:t>
+      </w:r>
+      <w:proofErr w:type="spellStart"/>
+      <w:r>
+        <w:rPr>
+          <w:rFonts w:ascii="Arial" w:hAnsi="Arial" w:cs="Arial"/>
+          <w:b/>
+          <w:bCs/>
+          <w:sz w:val="20"/>
+          <w:szCs w:val="20"/>
+          <w:lang w:eastAsia="en-US"/>
+        </w:rPr>
+        <w:t>setup</w:t>
+      </w:r>
+      <w:proofErr w:type="spellEnd"/>
+      <w:r>
+        <w:rPr>
+          <w:rFonts w:ascii="Arial" w:hAnsi="Arial" w:cs="Arial"/>
+          <w:b/>
+          <w:bCs/>
+          <w:sz w:val="20"/>
+          <w:szCs w:val="20"/>
+          <w:lang w:eastAsia="en-US"/>
+        </w:rPr>
+        <w:t xml:space="preserve"> time y el </w:t>
+      </w:r>
+      <w:proofErr w:type="spellStart"/>
+      <w:r>
+        <w:rPr>
+          <w:rFonts w:ascii="Arial" w:hAnsi="Arial" w:cs="Arial"/>
+          <w:b/>
+          <w:bCs/>
+          <w:sz w:val="20"/>
+          <w:szCs w:val="20"/>
+          <w:lang w:eastAsia="en-US"/>
+        </w:rPr>
+        <w:t>hold</w:t>
+      </w:r>
+      <w:proofErr w:type="spellEnd"/>
+      <w:r>
+        <w:rPr>
+          <w:rFonts w:ascii="Arial" w:hAnsi="Arial" w:cs="Arial"/>
+          <w:b/>
+          <w:bCs/>
+          <w:sz w:val="20"/>
+          <w:szCs w:val="20"/>
+          <w:lang w:eastAsia="en-US"/>
+        </w:rPr>
+        <w:t xml:space="preserve"> time. [11]</w:t>
       </w:r>
     </w:p>
     <w:p>
@@ -1763,14 +3164,18 @@
       <w:pPr>
         <w:rPr>
           <w:rFonts w:ascii="Arial" w:hAnsi="Arial" w:cs="Arial"/>
-          <w:sz w:val="20"/>
-          <w:szCs w:val="20"/>
-          <w:lang w:eastAsia="en-US"/>
-        </w:rPr>
-      </w:pPr>
-      <w:r>
-        <w:rPr>
-          <w:rFonts w:ascii="Arial" w:hAnsi="Arial" w:cs="Arial"/>
+          <w:b/>
+          <w:bCs/>
+          <w:sz w:val="20"/>
+          <w:szCs w:val="20"/>
+          <w:lang w:eastAsia="en-US"/>
+        </w:rPr>
+      </w:pPr>
+      <w:r>
+        <w:rPr>
+          <w:rFonts w:ascii="Arial" w:hAnsi="Arial" w:cs="Arial"/>
+          <w:b/>
+          <w:bCs/>
           <w:sz w:val="20"/>
           <w:szCs w:val="20"/>
           <w:lang w:eastAsia="en-US"/>
@@ -1809,35 +3214,153 @@
           <w:szCs w:val="20"/>
           <w:lang w:eastAsia="en-US"/>
         </w:rPr>
-        <w:t>¿Cuál es la diferencia de validación pre-sicilio y post-silicio?</w:t>
-      </w:r>
-    </w:p>
-    <w:p>
-      <w:pPr>
-        <w:rPr>
-          <w:rFonts w:ascii="Arial" w:hAnsi="Arial" w:cs="Arial"/>
-          <w:sz w:val="20"/>
-          <w:szCs w:val="20"/>
-          <w:lang w:eastAsia="en-US"/>
-        </w:rPr>
-      </w:pPr>
-      <w:r>
-        <w:rPr>
-          <w:rFonts w:ascii="Arial" w:hAnsi="Arial" w:cs="Arial"/>
-          <w:sz w:val="20"/>
-          <w:szCs w:val="20"/>
-          <w:lang w:eastAsia="en-US"/>
-        </w:rPr>
-        <w:t>En pre-silicio se tiene el diseño</w:t>
-      </w:r>
-      <w:r>
-        <w:rPr>
-          <w:rFonts w:ascii="Arial" w:hAnsi="Arial" w:cs="Arial"/>
-          <w:sz w:val="20"/>
-          <w:szCs w:val="20"/>
-          <w:lang w:eastAsia="en-US"/>
-        </w:rPr>
-        <w:t xml:space="preserve"> y sumladores para correr las pruebas, teniendo total visibilidad y control. En post-silicio, ya son pruebas con el hardware real por lo que son más rápidas, pero no se tiene total acceso. [14]</w:t>
+        <w:t xml:space="preserve">¿Cuál es la diferencia de validación </w:t>
+      </w:r>
+      <w:proofErr w:type="spellStart"/>
+      <w:r>
+        <w:rPr>
+          <w:rFonts w:ascii="Arial" w:hAnsi="Arial" w:cs="Arial"/>
+          <w:sz w:val="20"/>
+          <w:szCs w:val="20"/>
+          <w:lang w:eastAsia="en-US"/>
+        </w:rPr>
+        <w:t>pre-sicilio</w:t>
+      </w:r>
+      <w:proofErr w:type="spellEnd"/>
+      <w:r>
+        <w:rPr>
+          <w:rFonts w:ascii="Arial" w:hAnsi="Arial" w:cs="Arial"/>
+          <w:sz w:val="20"/>
+          <w:szCs w:val="20"/>
+          <w:lang w:eastAsia="en-US"/>
+        </w:rPr>
+        <w:t xml:space="preserve"> y </w:t>
+      </w:r>
+      <w:proofErr w:type="spellStart"/>
+      <w:r>
+        <w:rPr>
+          <w:rFonts w:ascii="Arial" w:hAnsi="Arial" w:cs="Arial"/>
+          <w:sz w:val="20"/>
+          <w:szCs w:val="20"/>
+          <w:lang w:eastAsia="en-US"/>
+        </w:rPr>
+        <w:t>post-silicio</w:t>
+      </w:r>
+      <w:proofErr w:type="spellEnd"/>
+      <w:r>
+        <w:rPr>
+          <w:rFonts w:ascii="Arial" w:hAnsi="Arial" w:cs="Arial"/>
+          <w:sz w:val="20"/>
+          <w:szCs w:val="20"/>
+          <w:lang w:eastAsia="en-US"/>
+        </w:rPr>
+        <w:t>?</w:t>
+      </w:r>
+    </w:p>
+    <w:p>
+      <w:pPr>
+        <w:rPr>
+          <w:rFonts w:ascii="Arial" w:hAnsi="Arial" w:cs="Arial"/>
+          <w:b/>
+          <w:bCs/>
+          <w:sz w:val="20"/>
+          <w:szCs w:val="20"/>
+          <w:lang w:eastAsia="en-US"/>
+        </w:rPr>
+      </w:pPr>
+      <w:r>
+        <w:rPr>
+          <w:rFonts w:ascii="Arial" w:hAnsi="Arial" w:cs="Arial"/>
+          <w:b/>
+          <w:bCs/>
+          <w:sz w:val="20"/>
+          <w:szCs w:val="20"/>
+          <w:lang w:eastAsia="en-US"/>
+        </w:rPr>
+        <w:t xml:space="preserve">En </w:t>
+      </w:r>
+      <w:proofErr w:type="spellStart"/>
+      <w:r>
+        <w:rPr>
+          <w:rFonts w:ascii="Arial" w:hAnsi="Arial" w:cs="Arial"/>
+          <w:b/>
+          <w:bCs/>
+          <w:sz w:val="20"/>
+          <w:szCs w:val="20"/>
+          <w:lang w:eastAsia="en-US"/>
+        </w:rPr>
+        <w:t>pre-silicio</w:t>
+      </w:r>
+      <w:proofErr w:type="spellEnd"/>
+      <w:r>
+        <w:rPr>
+          <w:rFonts w:ascii="Arial" w:hAnsi="Arial" w:cs="Arial"/>
+          <w:b/>
+          <w:bCs/>
+          <w:sz w:val="20"/>
+          <w:szCs w:val="20"/>
+          <w:lang w:eastAsia="en-US"/>
+        </w:rPr>
+        <w:t xml:space="preserve"> se tiene el diseño</w:t>
+      </w:r>
+      <w:r>
+        <w:rPr>
+          <w:rFonts w:ascii="Arial" w:hAnsi="Arial" w:cs="Arial"/>
+          <w:b/>
+          <w:bCs/>
+          <w:sz w:val="20"/>
+          <w:szCs w:val="20"/>
+          <w:lang w:eastAsia="en-US"/>
+        </w:rPr>
+        <w:t xml:space="preserve"> y </w:t>
+      </w:r>
+      <w:proofErr w:type="spellStart"/>
+      <w:r>
+        <w:rPr>
+          <w:rFonts w:ascii="Arial" w:hAnsi="Arial" w:cs="Arial"/>
+          <w:b/>
+          <w:bCs/>
+          <w:sz w:val="20"/>
+          <w:szCs w:val="20"/>
+          <w:lang w:eastAsia="en-US"/>
+        </w:rPr>
+        <w:t>sumladores</w:t>
+      </w:r>
+      <w:proofErr w:type="spellEnd"/>
+      <w:r>
+        <w:rPr>
+          <w:rFonts w:ascii="Arial" w:hAnsi="Arial" w:cs="Arial"/>
+          <w:b/>
+          <w:bCs/>
+          <w:sz w:val="20"/>
+          <w:szCs w:val="20"/>
+          <w:lang w:eastAsia="en-US"/>
+        </w:rPr>
+        <w:t xml:space="preserve"> para correr las pruebas, teniendo total visibilidad y control. En </w:t>
+      </w:r>
+      <w:proofErr w:type="spellStart"/>
+      <w:r>
+        <w:rPr>
+          <w:rFonts w:ascii="Arial" w:hAnsi="Arial" w:cs="Arial"/>
+          <w:b/>
+          <w:bCs/>
+          <w:sz w:val="20"/>
+          <w:szCs w:val="20"/>
+          <w:lang w:eastAsia="en-US"/>
+        </w:rPr>
+        <w:t>post-silicio</w:t>
+      </w:r>
+      <w:proofErr w:type="spellEnd"/>
+      <w:r>
+        <w:rPr>
+          <w:rFonts w:ascii="Arial" w:hAnsi="Arial" w:cs="Arial"/>
+          <w:b/>
+          <w:bCs/>
+          <w:sz w:val="20"/>
+          <w:szCs w:val="20"/>
+          <w:lang w:eastAsia="en-US"/>
+        </w:rPr>
+        <w:t>, ya son pruebas con el hardware real por lo que son más rápidas, pero no se tiene total acceso. [14]</w:t>
       </w:r>
     </w:p>
     <w:p>
@@ -1871,21 +3394,45 @@
           <w:szCs w:val="20"/>
           <w:lang w:eastAsia="en-US"/>
         </w:rPr>
-        <w:t>¿Qué es máquina de estados tipo mealy?</w:t>
-      </w:r>
-    </w:p>
-    <w:p>
-      <w:pPr>
-        <w:rPr>
-          <w:rFonts w:ascii="Arial" w:hAnsi="Arial" w:cs="Arial"/>
-          <w:sz w:val="20"/>
-          <w:szCs w:val="20"/>
-          <w:lang w:eastAsia="en-US"/>
-        </w:rPr>
-      </w:pPr>
-      <w:r>
-        <w:rPr>
-          <w:rFonts w:ascii="Arial" w:hAnsi="Arial" w:cs="Arial"/>
+        <w:t xml:space="preserve">¿Qué es máquina de estados tipo </w:t>
+      </w:r>
+      <w:proofErr w:type="spellStart"/>
+      <w:r>
+        <w:rPr>
+          <w:rFonts w:ascii="Arial" w:hAnsi="Arial" w:cs="Arial"/>
+          <w:sz w:val="20"/>
+          <w:szCs w:val="20"/>
+          <w:lang w:eastAsia="en-US"/>
+        </w:rPr>
+        <w:t>mealy</w:t>
+      </w:r>
+      <w:proofErr w:type="spellEnd"/>
+      <w:r>
+        <w:rPr>
+          <w:rFonts w:ascii="Arial" w:hAnsi="Arial" w:cs="Arial"/>
+          <w:sz w:val="20"/>
+          <w:szCs w:val="20"/>
+          <w:lang w:eastAsia="en-US"/>
+        </w:rPr>
+        <w:t>?</w:t>
+      </w:r>
+    </w:p>
+    <w:p>
+      <w:pPr>
+        <w:rPr>
+          <w:rFonts w:ascii="Arial" w:hAnsi="Arial" w:cs="Arial"/>
+          <w:b/>
+          <w:bCs/>
+          <w:sz w:val="20"/>
+          <w:szCs w:val="20"/>
+          <w:lang w:eastAsia="en-US"/>
+        </w:rPr>
+      </w:pPr>
+      <w:r>
+        <w:rPr>
+          <w:rFonts w:ascii="Arial" w:hAnsi="Arial" w:cs="Arial"/>
+          <w:b/>
+          <w:bCs/>
           <w:sz w:val="20"/>
           <w:szCs w:val="20"/>
           <w:lang w:eastAsia="en-US"/>
@@ -1922,8 +3469,32 @@
       </w:r>
     </w:p>
     <w:p>
-      <w:r>
-        <w:t>Es una maquina de estados finitos cuya salida depende solo del estado actual. [15]</w:t>
+      <w:pPr>
+        <w:rPr>
+          <w:b/>
+          <w:bCs/>
+        </w:rPr>
+      </w:pPr>
+      <w:r>
+        <w:rPr>
+          <w:b/>
+          <w:bCs/>
+        </w:rPr>
+        <w:t xml:space="preserve">Es una </w:t>
+      </w:r>
+      <w:r>
+        <w:rPr>
+          <w:b/>
+          <w:bCs/>
+        </w:rPr>
+        <w:t>máquina</w:t>
+      </w:r>
+      <w:r>
+        <w:rPr>
+          <w:b/>
+          <w:bCs/>
+        </w:rPr>
+        <w:t xml:space="preserve"> de estados finitos cuya salida depende solo del estado actual. [15]</w:t>
       </w:r>
     </w:p>
     <w:p/>
@@ -1964,7 +3535,17 @@
       </w:r>
     </w:p>
     <w:p>
-      <w:r>
+      <w:pPr>
+        <w:rPr>
+          <w:b/>
+          <w:bCs/>
+        </w:rPr>
+      </w:pPr>
+      <w:r>
+        <w:rPr>
+          <w:b/>
+          <w:bCs/>
+        </w:rPr>
         <w:t>Register Transfer Level. Nivel de abstracción donde se describe el funcionamiento a nivel de registros, su flujo y operaciones, pero sin especificar la implementación física a nivel de transistores. [16]</w:t>
       </w:r>
     </w:p>
@@ -1984,12 +3565,138 @@
           <w:szCs w:val="20"/>
           <w:lang w:eastAsia="en-US"/>
         </w:rPr>
-        <w:t>¿Qué es SystemVerilog UVM?</w:t>
-      </w:r>
-    </w:p>
-    <w:p>
-      <w:r>
-        <w:t>Universal Verification Methodology. Framework de programación orientada a objetos basado en SystemVerilog y su propósito es hacer testbenches reutilizables y escalables para probar ASICS, FPGAs y SoCs. Contiene drivers, monitores, secuenciaros, agentes, pruebas, etc. [17]</w:t>
+        <w:t xml:space="preserve">¿Qué es </w:t>
+      </w:r>
+      <w:proofErr w:type="spellStart"/>
+      <w:r>
+        <w:rPr>
+          <w:rFonts w:ascii="Arial" w:hAnsi="Arial" w:cs="Arial"/>
+          <w:sz w:val="20"/>
+          <w:szCs w:val="20"/>
+          <w:lang w:eastAsia="en-US"/>
+        </w:rPr>
+        <w:t>SystemVerilog</w:t>
+      </w:r>
+      <w:proofErr w:type="spellEnd"/>
+      <w:r>
+        <w:rPr>
+          <w:rFonts w:ascii="Arial" w:hAnsi="Arial" w:cs="Arial"/>
+          <w:sz w:val="20"/>
+          <w:szCs w:val="20"/>
+          <w:lang w:eastAsia="en-US"/>
+        </w:rPr>
+        <w:t xml:space="preserve"> UVM?</w:t>
+      </w:r>
+    </w:p>
+    <w:p>
+      <w:pPr>
+        <w:rPr>
+          <w:b/>
+          <w:bCs/>
+        </w:rPr>
+      </w:pPr>
+      <w:r>
+        <w:rPr>
+          <w:b/>
+          <w:bCs/>
+        </w:rPr>
+        <w:t xml:space="preserve">Universal </w:t>
+      </w:r>
+      <w:proofErr w:type="spellStart"/>
+      <w:r>
+        <w:rPr>
+          <w:b/>
+          <w:bCs/>
+        </w:rPr>
+        <w:t>Verification</w:t>
+      </w:r>
+      <w:proofErr w:type="spellEnd"/>
+      <w:r>
+        <w:rPr>
+          <w:b/>
+          <w:bCs/>
+        </w:rPr>
+        <w:t xml:space="preserve"> </w:t>
+      </w:r>
+      <w:proofErr w:type="spellStart"/>
+      <w:r>
+        <w:rPr>
+          <w:b/>
+          <w:bCs/>
+        </w:rPr>
+        <w:t>Methodology</w:t>
+      </w:r>
+      <w:proofErr w:type="spellEnd"/>
+      <w:r>
+        <w:rPr>
+          <w:b/>
+          <w:bCs/>
+        </w:rPr>
+        <w:t xml:space="preserve">. Framework de programación orientada a objetos basado en </w:t>
+      </w:r>
+      <w:proofErr w:type="spellStart"/>
+      <w:r>
+        <w:rPr>
+          <w:b/>
+          <w:bCs/>
+        </w:rPr>
+        <w:t>SystemVerilog</w:t>
+      </w:r>
+      <w:proofErr w:type="spellEnd"/>
+      <w:r>
+        <w:rPr>
+          <w:b/>
+          <w:bCs/>
+        </w:rPr>
+        <w:t xml:space="preserve"> y su propósito es hacer </w:t>
+      </w:r>
+      <w:proofErr w:type="spellStart"/>
+      <w:r>
+        <w:rPr>
+          <w:b/>
+          <w:bCs/>
+        </w:rPr>
+        <w:t>testbenches</w:t>
+      </w:r>
+      <w:proofErr w:type="spellEnd"/>
+      <w:r>
+        <w:rPr>
+          <w:b/>
+          <w:bCs/>
+        </w:rPr>
+        <w:t xml:space="preserve"> reutilizables y escalables para probar ASICS, </w:t>
+      </w:r>
+      <w:proofErr w:type="spellStart"/>
+      <w:r>
+        <w:rPr>
+          <w:b/>
+          <w:bCs/>
+        </w:rPr>
+        <w:t>FPGAs</w:t>
+      </w:r>
+      <w:proofErr w:type="spellEnd"/>
+      <w:r>
+        <w:rPr>
+          <w:b/>
+          <w:bCs/>
+        </w:rPr>
+        <w:t xml:space="preserve"> y </w:t>
+      </w:r>
+      <w:proofErr w:type="spellStart"/>
+      <w:r>
+        <w:rPr>
+          <w:b/>
+          <w:bCs/>
+        </w:rPr>
+        <w:t>SoCs</w:t>
+      </w:r>
+      <w:proofErr w:type="spellEnd"/>
+      <w:r>
+        <w:rPr>
+          <w:b/>
+          <w:bCs/>
+        </w:rPr>
+        <w:t>. Contiene drivers, monitores, secuenciaros, agentes, pruebas, etc. [17]</w:t>
       </w:r>
     </w:p>
     <w:p/>
@@ -2012,7 +3719,17 @@
       </w:r>
     </w:p>
     <w:p>
-      <w:r>
+      <w:pPr>
+        <w:rPr>
+          <w:b/>
+          <w:bCs/>
+        </w:rPr>
+      </w:pPr>
+      <w:r>
+        <w:rPr>
+          <w:b/>
+          <w:bCs/>
+        </w:rPr>
         <w:t>Verificación es revisar que el producto va cumpliendo con el nivel técnico y especificaciones. Validación es revisar que el producto funcione bajo condiciones reales y de estrés para confirmar que el producto cumple con lo prometido al cliente. [18]</w:t>
       </w:r>
     </w:p>
@@ -2044,7 +3761,6 @@
           <w:szCs w:val="20"/>
           <w:lang w:eastAsia="en-US"/>
         </w:rPr>
-        <w:lastRenderedPageBreak/>
         <w:t>REFERENCIAS</w:t>
       </w:r>
     </w:p>
@@ -2070,8 +3786,17 @@
           <w:i/>
           <w:iCs/>
         </w:rPr>
-        <w:t>TRBL Services</w:t>
-      </w:r>
+        <w:t xml:space="preserve">TRBL </w:t>
+      </w:r>
+      <w:proofErr w:type="spellStart"/>
+      <w:r>
+        <w:rPr>
+          <w:i/>
+          <w:iCs/>
+        </w:rPr>
+        <w:t>Services</w:t>
+      </w:r>
+      <w:proofErr w:type="spellEnd"/>
       <w:r>
         <w:t xml:space="preserve">, 25 de enero de 2024. </w:t>
       </w:r>
@@ -2091,6 +3816,7 @@
       <w:r>
         <w:t xml:space="preserve">J. Romero, «¿Qué es un ASIC y para qué sirve?», </w:t>
       </w:r>
+      <w:proofErr w:type="spellStart"/>
       <w:r>
         <w:rPr>
           <w:i/>
@@ -2098,6 +3824,7 @@
         </w:rPr>
         <w:t>Geeknetic</w:t>
       </w:r>
+      <w:proofErr w:type="spellEnd"/>
       <w:r>
         <w:t xml:space="preserve">, 4 de noviembre de 2022. </w:t>
       </w:r>
@@ -2121,7 +3848,35 @@
         <w:rPr>
           <w:lang w:val="en-US"/>
         </w:rPr>
-        <w:t xml:space="preserve">G. Patrick, «7 leading semiconductor foundry companies serving as backbone of electronic manufacturing», </w:t>
+        <w:t xml:space="preserve">G. </w:t>
+      </w:r>
+      <w:proofErr w:type="gramStart"/>
+      <w:r>
+        <w:rPr>
+          <w:lang w:val="en-US"/>
+        </w:rPr>
+        <w:t>Patrick, «</w:t>
+      </w:r>
+      <w:proofErr w:type="gramEnd"/>
+      <w:r>
+        <w:rPr>
+          <w:lang w:val="en-US"/>
+        </w:rPr>
+        <w:t xml:space="preserve">7 leading semiconductor foundry companies serving as backbone of electronic </w:t>
+      </w:r>
+      <w:proofErr w:type="gramStart"/>
+      <w:r>
+        <w:rPr>
+          <w:lang w:val="en-US"/>
+        </w:rPr>
+        <w:t>manufacturing»,</w:t>
+      </w:r>
+      <w:proofErr w:type="gramEnd"/>
+      <w:r>
+        <w:rPr>
+          <w:lang w:val="en-US"/>
+        </w:rPr>
+        <w:t xml:space="preserve"> </w:t>
       </w:r>
       <w:r>
         <w:rPr>
@@ -2135,7 +3890,21 @@
         <w:rPr>
           <w:lang w:val="en-US"/>
         </w:rPr>
-        <w:t xml:space="preserve">, marzo de 2026. </w:t>
+        <w:t xml:space="preserve">, </w:t>
+      </w:r>
+      <w:proofErr w:type="spellStart"/>
+      <w:r>
+        <w:rPr>
+          <w:lang w:val="en-US"/>
+        </w:rPr>
+        <w:t>marzo</w:t>
+      </w:r>
+      <w:proofErr w:type="spellEnd"/>
+      <w:r>
+        <w:rPr>
+          <w:lang w:val="en-US"/>
+        </w:rPr>
+        <w:t xml:space="preserve"> de 2026. </w:t>
       </w:r>
       <w:hyperlink r:id="rId11" w:history="1">
         <w:r>
@@ -2150,8 +3919,29 @@
       <w:r>
         <w:t xml:space="preserve">[4] </w:t>
       </w:r>
-      <w:r>
-        <w:t xml:space="preserve">MrUniversity, «Tecnología CMOS - Lógica de los transistores pMOS y nMOS», </w:t>
+      <w:proofErr w:type="spellStart"/>
+      <w:r>
+        <w:t>MrUniversity</w:t>
+      </w:r>
+      <w:proofErr w:type="spellEnd"/>
+      <w:r>
+        <w:t xml:space="preserve">, «Tecnología CMOS - Lógica de los transistores </w:t>
+      </w:r>
+      <w:proofErr w:type="spellStart"/>
+      <w:r>
+        <w:t>pMOS</w:t>
+      </w:r>
+      <w:proofErr w:type="spellEnd"/>
+      <w:r>
+        <w:t xml:space="preserve"> y </w:t>
+      </w:r>
+      <w:proofErr w:type="spellStart"/>
+      <w:r>
+        <w:t>nMOS</w:t>
+      </w:r>
+      <w:proofErr w:type="spellEnd"/>
+      <w:r>
+        <w:t xml:space="preserve">», </w:t>
       </w:r>
       <w:r>
         <w:rPr>
@@ -2168,19 +3958,7 @@
           <w:rPr>
             <w:rStyle w:val="Hipervnculo"/>
           </w:rPr>
-          <w:t>https://www.youtube.com/watch?v=ZE</w:t>
-        </w:r>
-        <w:r>
-          <w:rPr>
-            <w:rStyle w:val="Hipervnculo"/>
-          </w:rPr>
-          <w:t>5</w:t>
-        </w:r>
-        <w:r>
-          <w:rPr>
-            <w:rStyle w:val="Hipervnculo"/>
-          </w:rPr>
-          <w:t>MTKYWp78</w:t>
+          <w:t>https://www.youtube.com/watch?v=ZE5MTKYWp78</w:t>
         </w:r>
       </w:hyperlink>
     </w:p>
@@ -2196,19 +3974,7 @@
           <w:rPr>
             <w:rStyle w:val="Hipervnculo"/>
           </w:rPr>
-          <w:t>https://archive.npte</w:t>
-        </w:r>
-        <w:r>
-          <w:rPr>
-            <w:rStyle w:val="Hipervnculo"/>
-          </w:rPr>
-          <w:t>l</w:t>
-        </w:r>
-        <w:r>
-          <w:rPr>
-            <w:rStyle w:val="Hipervnculo"/>
-          </w:rPr>
-          <w:t>.ac.in/content/storage2/courses/117101058/Slides/32.2.htm</w:t>
+          <w:t>https://archive.nptel.ac.in/content/storage2/courses/117101058/Slides/32.2.htm</w:t>
         </w:r>
       </w:hyperlink>
     </w:p>
@@ -2256,7 +4022,31 @@
         <w:t xml:space="preserve">[7] </w:t>
       </w:r>
       <w:r>
-        <w:t>«Synthesizable vs Non-synthesizable constructs», 24 de julio de 2025. </w:t>
+        <w:t>«</w:t>
+      </w:r>
+      <w:proofErr w:type="spellStart"/>
+      <w:r>
+        <w:t>Synthesizable</w:t>
+      </w:r>
+      <w:proofErr w:type="spellEnd"/>
+      <w:r>
+        <w:t xml:space="preserve"> vs Non-</w:t>
+      </w:r>
+      <w:proofErr w:type="spellStart"/>
+      <w:r>
+        <w:t>synthesizable</w:t>
+      </w:r>
+      <w:proofErr w:type="spellEnd"/>
+      <w:r>
+        <w:t xml:space="preserve"> </w:t>
+      </w:r>
+      <w:proofErr w:type="spellStart"/>
+      <w:r>
+        <w:t>constructs</w:t>
+      </w:r>
+      <w:proofErr w:type="spellEnd"/>
+      <w:r>
+        <w:t>», 24 de julio de 2025. </w:t>
       </w:r>
       <w:hyperlink r:id="rId15" w:history="1">
         <w:r>
@@ -2268,11 +4058,24 @@
       </w:hyperlink>
     </w:p>
     <w:p>
+      <w:pPr>
+        <w:rPr>
+          <w:lang w:val="en-US"/>
+        </w:rPr>
+      </w:pPr>
       <w:r>
         <w:t xml:space="preserve">[8] </w:t>
       </w:r>
       <w:r>
-        <w:t>J. Schneider y I. Smalley, «Field Programmable Gate Array», </w:t>
+        <w:t xml:space="preserve">J. Schneider y I. Smalley, «Field </w:t>
+      </w:r>
+      <w:proofErr w:type="spellStart"/>
+      <w:r>
+        <w:t>Programmable</w:t>
+      </w:r>
+      <w:proofErr w:type="spellEnd"/>
+      <w:r>
+        <w:t xml:space="preserve"> Gate Array», </w:t>
       </w:r>
       <w:r>
         <w:rPr>
@@ -2285,38 +4088,61 @@
         <w:t>, 14 de mayo de 2026. </w:t>
       </w:r>
       <w:hyperlink r:id="rId16" w:history="1">
-        <w:r>
-          <w:rPr>
-            <w:rStyle w:val="Hipervnculo"/>
-          </w:rPr>
-          <w:t>https://www.ibm.com/think/topics/field-programmable-gate-arrays</w:t>
-        </w:r>
-      </w:hyperlink>
-    </w:p>
-    <w:p>
-      <w:pPr>
-        <w:rPr>
-          <w:lang w:val="en-US"/>
-        </w:rPr>
-      </w:pPr>
-      <w:r>
-        <w:rPr>
-          <w:lang w:val="en-US"/>
-        </w:rPr>
-        <w:t xml:space="preserve">[9] </w:t>
-      </w:r>
-      <w:r>
-        <w:rPr>
-          <w:lang w:val="en-US"/>
-        </w:rPr>
-        <w:t>«ASIC Design Flow — ASEEC blog». </w:t>
-      </w:r>
-      <w:hyperlink r:id="rId17" w:history="1">
         <w:r>
           <w:rPr>
             <w:rStyle w:val="Hipervnculo"/>
             <w:lang w:val="en-US"/>
           </w:rPr>
+          <w:t>https://www.ibm.com/think/topics/field-programmable-gate-arrays</w:t>
+        </w:r>
+      </w:hyperlink>
+    </w:p>
+    <w:p>
+      <w:r>
+        <w:rPr>
+          <w:lang w:val="en-US"/>
+        </w:rPr>
+        <w:t>[</w:t>
+      </w:r>
+      <w:proofErr w:type="gramStart"/>
+      <w:r>
+        <w:rPr>
+          <w:lang w:val="en-US"/>
+        </w:rPr>
+        <w:t xml:space="preserve">9] </w:t>
+      </w:r>
+      <w:r>
+        <w:rPr>
+          <w:lang w:val="en-US"/>
+        </w:rPr>
+        <w:t>«</w:t>
+      </w:r>
+      <w:proofErr w:type="gramEnd"/>
+      <w:r>
+        <w:rPr>
+          <w:lang w:val="en-US"/>
+        </w:rPr>
+        <w:t xml:space="preserve">ASIC Design Flow — ASEEC </w:t>
+      </w:r>
+      <w:proofErr w:type="gramStart"/>
+      <w:r>
+        <w:rPr>
+          <w:lang w:val="en-US"/>
+        </w:rPr>
+        <w:t>blog».</w:t>
+      </w:r>
+      <w:proofErr w:type="gramEnd"/>
+      <w:r>
+        <w:rPr>
+          <w:lang w:val="en-US"/>
+        </w:rPr>
+        <w:t> </w:t>
+      </w:r>
+      <w:hyperlink r:id="rId17" w:history="1">
+        <w:r>
+          <w:rPr>
+            <w:rStyle w:val="Hipervnculo"/>
+          </w:rPr>
           <w:t>https://ucd-aseec.github.io/aseec-lab-website/blog/asic-design-flow.html</w:t>
         </w:r>
       </w:hyperlink>
@@ -2333,11 +4159,19 @@
         </w:rPr>
         <w:t xml:space="preserve">[10] </w:t>
       </w:r>
-      <w:r>
-        <w:rPr>
-          <w:lang w:val="en-US"/>
-        </w:rPr>
-        <w:t>XJTAG, «What is JTAG and how can I make use of it? - XJTAG Tutorial», </w:t>
+      <w:proofErr w:type="gramStart"/>
+      <w:r>
+        <w:rPr>
+          <w:lang w:val="en-US"/>
+        </w:rPr>
+        <w:t>XJTAG, «</w:t>
+      </w:r>
+      <w:proofErr w:type="gramEnd"/>
+      <w:r>
+        <w:rPr>
+          <w:lang w:val="en-US"/>
+        </w:rPr>
+        <w:t>What is JTAG and how can I make use of it? - XJTAG Tutorial», </w:t>
       </w:r>
       <w:r>
         <w:rPr>
@@ -2351,7 +4185,21 @@
         <w:rPr>
           <w:lang w:val="en-US"/>
         </w:rPr>
-        <w:t>, 17 de junio de 2026. </w:t>
+        <w:t xml:space="preserve">, 17 de </w:t>
+      </w:r>
+      <w:proofErr w:type="spellStart"/>
+      <w:r>
+        <w:rPr>
+          <w:lang w:val="en-US"/>
+        </w:rPr>
+        <w:t>junio</w:t>
+      </w:r>
+      <w:proofErr w:type="spellEnd"/>
+      <w:r>
+        <w:rPr>
+          <w:lang w:val="en-US"/>
+        </w:rPr>
+        <w:t xml:space="preserve"> de 2026. </w:t>
       </w:r>
       <w:hyperlink r:id="rId18" w:history="1">
         <w:r>
@@ -2379,7 +4227,21 @@
         <w:rPr>
           <w:lang w:val="en-US"/>
         </w:rPr>
-        <w:t>«Setup and Hold Time: Definition, Importance, and Timing Analysis», 19 de diciembre de 2024. </w:t>
+        <w:t xml:space="preserve">«Setup and Hold Time: Definition, Importance, and Timing Analysis», 19 de </w:t>
+      </w:r>
+      <w:proofErr w:type="spellStart"/>
+      <w:r>
+        <w:rPr>
+          <w:lang w:val="en-US"/>
+        </w:rPr>
+        <w:t>diciembre</w:t>
+      </w:r>
+      <w:proofErr w:type="spellEnd"/>
+      <w:r>
+        <w:rPr>
+          <w:lang w:val="en-US"/>
+        </w:rPr>
+        <w:t xml:space="preserve"> de 2024. </w:t>
       </w:r>
       <w:hyperlink r:id="rId19" w:history="1">
         <w:r>
@@ -2387,41 +4249,66 @@
             <w:rStyle w:val="Hipervnculo"/>
             <w:lang w:val="en-US"/>
           </w:rPr>
-          <w:t>https://analogcircuitdesign.co</w:t>
-        </w:r>
-        <w:r>
-          <w:rPr>
-            <w:rStyle w:val="Hipervnculo"/>
-            <w:lang w:val="en-US"/>
-          </w:rPr>
-          <w:t>m</w:t>
-        </w:r>
-        <w:r>
-          <w:rPr>
-            <w:rStyle w:val="Hipervnculo"/>
-            <w:lang w:val="en-US"/>
-          </w:rPr>
-          <w:t>/setup-and-hold-time/</w:t>
+          <w:t>https://analogcircuitdesign.com/setup-and-hold-time/</w:t>
         </w:r>
       </w:hyperlink>
     </w:p>
     <w:p>
-      <w:pPr>
-        <w:rPr>
-          <w:lang w:val="en-US"/>
-        </w:rPr>
-      </w:pPr>
       <w:r>
         <w:rPr>
           <w:lang w:val="en-US"/>
         </w:rPr>
         <w:t xml:space="preserve">[12] </w:t>
       </w:r>
-      <w:r>
-        <w:rPr>
-          <w:lang w:val="en-US"/>
-        </w:rPr>
-        <w:t>WatElectronics y WatElectronics, «What are Latches? and How they Differ from Flip-Flop?», </w:t>
+      <w:proofErr w:type="spellStart"/>
+      <w:r>
+        <w:rPr>
+          <w:lang w:val="en-US"/>
+        </w:rPr>
+        <w:t>WatElectronics</w:t>
+      </w:r>
+      <w:proofErr w:type="spellEnd"/>
+      <w:r>
+        <w:rPr>
+          <w:lang w:val="en-US"/>
+        </w:rPr>
+        <w:t xml:space="preserve"> y </w:t>
+      </w:r>
+      <w:proofErr w:type="spellStart"/>
+      <w:proofErr w:type="gramStart"/>
+      <w:r>
+        <w:rPr>
+          <w:lang w:val="en-US"/>
+        </w:rPr>
+        <w:t>WatElectronics</w:t>
+      </w:r>
+      <w:proofErr w:type="spellEnd"/>
+      <w:r>
+        <w:rPr>
+          <w:lang w:val="en-US"/>
+        </w:rPr>
+        <w:t>, «</w:t>
+      </w:r>
+      <w:proofErr w:type="gramEnd"/>
+      <w:r>
+        <w:rPr>
+          <w:lang w:val="en-US"/>
+        </w:rPr>
+        <w:t>What are Latches? and How they Differ from Flip-</w:t>
+      </w:r>
+      <w:proofErr w:type="gramStart"/>
+      <w:r>
+        <w:rPr>
+          <w:lang w:val="en-US"/>
+        </w:rPr>
+        <w:t>Flop?»</w:t>
+      </w:r>
+      <w:proofErr w:type="gramEnd"/>
+      <w:r>
+        <w:rPr>
+          <w:lang w:val="en-US"/>
+        </w:rPr>
+        <w:t>, </w:t>
       </w:r>
       <w:r>
         <w:rPr>
@@ -2435,13 +4322,26 @@
         <w:rPr>
           <w:lang w:val="en-US"/>
         </w:rPr>
-        <w:t>, 4 de febrero de 2022. </w:t>
+        <w:t xml:space="preserve">, 4 de </w:t>
+      </w:r>
+      <w:proofErr w:type="spellStart"/>
+      <w:r>
+        <w:rPr>
+          <w:lang w:val="en-US"/>
+        </w:rPr>
+        <w:t>febrero</w:t>
+      </w:r>
+      <w:proofErr w:type="spellEnd"/>
+      <w:r>
+        <w:rPr>
+          <w:lang w:val="en-US"/>
+        </w:rPr>
+        <w:t xml:space="preserve"> de 2022. </w:t>
       </w:r>
       <w:hyperlink r:id="rId20" w:history="1">
         <w:r>
           <w:rPr>
             <w:rStyle w:val="Hipervnculo"/>
-            <w:lang w:val="en-US"/>
           </w:rPr>
           <w:t>https://www.watelectronics.com/what-are-latches-and-how-they-are-differ-from-flip-flop/</w:t>
         </w:r>
@@ -2452,19 +4352,36 @@
         <w:t xml:space="preserve">[13] </w:t>
       </w:r>
       <w:r>
-        <w:t>I. Mecafenix, «Las diferencias de los circuitos combinacionales y secuenciales», </w:t>
+        <w:t xml:space="preserve">I. </w:t>
+      </w:r>
+      <w:proofErr w:type="spellStart"/>
+      <w:r>
+        <w:t>Mecafenix</w:t>
+      </w:r>
+      <w:proofErr w:type="spellEnd"/>
+      <w:r>
+        <w:t>, «Las diferencias de los circuitos combinacionales y secuenciales», </w:t>
       </w:r>
       <w:r>
         <w:rPr>
           <w:i/>
           <w:iCs/>
         </w:rPr>
-        <w:t>Ingeniería Mecafenix</w:t>
-      </w:r>
+        <w:t xml:space="preserve">Ingeniería </w:t>
+      </w:r>
+      <w:proofErr w:type="spellStart"/>
+      <w:r>
+        <w:rPr>
+          <w:i/>
+          <w:iCs/>
+        </w:rPr>
+        <w:t>Mecafenix</w:t>
+      </w:r>
+      <w:proofErr w:type="spellEnd"/>
       <w:r>
         <w:t>, 29 de noviembre de 2023. </w:t>
       </w:r>
-      <w:hyperlink r:id="rId21" w:history="1">
+      <w:hyperlink r:id="rId21" w:anchor="google_vignette" w:history="1">
         <w:r>
           <w:rPr>
             <w:rStyle w:val="Hipervnculo"/>
@@ -2477,9 +4394,31 @@
       <w:r>
         <w:t xml:space="preserve">[14] </w:t>
       </w:r>
-      <w:r>
-        <w:t>Vlsifacts, «Pre-Silicon Verification vs. Post-Silicon Validation», </w:t>
-      </w:r>
+      <w:proofErr w:type="spellStart"/>
+      <w:r>
+        <w:t>Vlsifacts</w:t>
+      </w:r>
+      <w:proofErr w:type="spellEnd"/>
+      <w:r>
+        <w:t xml:space="preserve">, «Pre-Silicon </w:t>
+      </w:r>
+      <w:proofErr w:type="spellStart"/>
+      <w:r>
+        <w:t>Verification</w:t>
+      </w:r>
+      <w:proofErr w:type="spellEnd"/>
+      <w:r>
+        <w:t xml:space="preserve"> vs. Post-Silicon </w:t>
+      </w:r>
+      <w:proofErr w:type="spellStart"/>
+      <w:r>
+        <w:t>Validation</w:t>
+      </w:r>
+      <w:proofErr w:type="spellEnd"/>
+      <w:r>
+        <w:t>», </w:t>
+      </w:r>
+      <w:proofErr w:type="spellStart"/>
       <w:r>
         <w:rPr>
           <w:i/>
@@ -2487,6 +4426,7 @@
         </w:rPr>
         <w:t>VLSIFacts</w:t>
       </w:r>
+      <w:proofErr w:type="spellEnd"/>
       <w:r>
         <w:t>, 17 de junio de 2025. </w:t>
       </w:r>
@@ -2500,22 +4440,39 @@
       </w:hyperlink>
     </w:p>
     <w:p>
-      <w:pPr>
-        <w:rPr>
-          <w:lang w:val="en-US"/>
-        </w:rPr>
-      </w:pPr>
       <w:r>
         <w:rPr>
           <w:lang w:val="en-US"/>
         </w:rPr>
         <w:t xml:space="preserve">[15] </w:t>
       </w:r>
-      <w:r>
-        <w:rPr>
-          <w:lang w:val="en-US"/>
-        </w:rPr>
-        <w:t>Denny, «Mealy vs Moore State Machines: With Examples», </w:t>
+      <w:proofErr w:type="gramStart"/>
+      <w:r>
+        <w:rPr>
+          <w:lang w:val="en-US"/>
+        </w:rPr>
+        <w:t>Denny, «</w:t>
+      </w:r>
+      <w:proofErr w:type="gramEnd"/>
+      <w:r>
+        <w:rPr>
+          <w:lang w:val="en-US"/>
+        </w:rPr>
+        <w:t xml:space="preserve">Mealy vs Moore State Machines: With </w:t>
+      </w:r>
+      <w:proofErr w:type="gramStart"/>
+      <w:r>
+        <w:rPr>
+          <w:lang w:val="en-US"/>
+        </w:rPr>
+        <w:t>Examples»,</w:t>
+      </w:r>
+      <w:proofErr w:type="gramEnd"/>
+      <w:r>
+        <w:rPr>
+          <w:lang w:val="en-US"/>
+        </w:rPr>
+        <w:t> </w:t>
       </w:r>
       <w:r>
         <w:rPr>
@@ -2529,24 +4486,32 @@
         <w:rPr>
           <w:lang w:val="en-US"/>
         </w:rPr>
-        <w:t>, 27 de julio de 2026. </w:t>
+        <w:t xml:space="preserve">, 27 de </w:t>
+      </w:r>
+      <w:proofErr w:type="spellStart"/>
+      <w:r>
+        <w:rPr>
+          <w:lang w:val="en-US"/>
+        </w:rPr>
+        <w:t>julio</w:t>
+      </w:r>
+      <w:proofErr w:type="spellEnd"/>
+      <w:r>
+        <w:rPr>
+          <w:lang w:val="en-US"/>
+        </w:rPr>
+        <w:t xml:space="preserve"> de 2026. </w:t>
       </w:r>
       <w:hyperlink r:id="rId23" w:history="1">
         <w:r>
           <w:rPr>
             <w:rStyle w:val="Hipervnculo"/>
-            <w:lang w:val="en-US"/>
           </w:rPr>
           <w:t>https://digisim.io/blog/mealy-vs-moore-state-machines-with-examples</w:t>
         </w:r>
       </w:hyperlink>
     </w:p>
     <w:p>
-      <w:pPr>
-        <w:rPr>
-          <w:lang w:val="en-US"/>
-        </w:rPr>
-      </w:pPr>
       <w:r>
         <w:rPr>
           <w:lang w:val="en-US"/>
@@ -2557,7 +4522,21 @@
         <w:rPr>
           <w:lang w:val="en-US"/>
         </w:rPr>
-        <w:t>Synopsys, «What is Register-Transfer-Level (RTL) Design?», </w:t>
+        <w:t xml:space="preserve">Synopsys, «What is Register-Transfer-Level (RTL) </w:t>
+      </w:r>
+      <w:proofErr w:type="gramStart"/>
+      <w:r>
+        <w:rPr>
+          <w:lang w:val="en-US"/>
+        </w:rPr>
+        <w:t>Design?»</w:t>
+      </w:r>
+      <w:proofErr w:type="gramEnd"/>
+      <w:r>
+        <w:rPr>
+          <w:lang w:val="en-US"/>
+        </w:rPr>
+        <w:t>, </w:t>
       </w:r>
       <w:r>
         <w:rPr>
@@ -2571,13 +4550,26 @@
         <w:rPr>
           <w:lang w:val="en-US"/>
         </w:rPr>
-        <w:t>, 8 de diciembre de 2025. </w:t>
+        <w:t xml:space="preserve">, 8 de </w:t>
+      </w:r>
+      <w:proofErr w:type="spellStart"/>
+      <w:r>
+        <w:rPr>
+          <w:lang w:val="en-US"/>
+        </w:rPr>
+        <w:t>diciembre</w:t>
+      </w:r>
+      <w:proofErr w:type="spellEnd"/>
+      <w:r>
+        <w:rPr>
+          <w:lang w:val="en-US"/>
+        </w:rPr>
+        <w:t xml:space="preserve"> de 2025. </w:t>
       </w:r>
       <w:hyperlink r:id="rId24" w:history="1">
         <w:r>
           <w:rPr>
             <w:rStyle w:val="Hipervnculo"/>
-            <w:lang w:val="en-US"/>
           </w:rPr>
           <w:t>https://www.synopsys.com/glossary/what-is-register-transfer-level-design.html</w:t>
         </w:r>
@@ -2599,7 +4591,35 @@
         <w:rPr>
           <w:lang w:val="en-US"/>
         </w:rPr>
-        <w:t>M. Bartley, «What Is UVM in Design Verification? Universal Verification Methodology Explained», </w:t>
+        <w:t xml:space="preserve">M. </w:t>
+      </w:r>
+      <w:proofErr w:type="gramStart"/>
+      <w:r>
+        <w:rPr>
+          <w:lang w:val="en-US"/>
+        </w:rPr>
+        <w:t>Bartley, «</w:t>
+      </w:r>
+      <w:proofErr w:type="gramEnd"/>
+      <w:r>
+        <w:rPr>
+          <w:lang w:val="en-US"/>
+        </w:rPr>
+        <w:t xml:space="preserve">What Is UVM in Design Verification? Universal Verification Methodology </w:t>
+      </w:r>
+      <w:proofErr w:type="gramStart"/>
+      <w:r>
+        <w:rPr>
+          <w:lang w:val="en-US"/>
+        </w:rPr>
+        <w:t>Explained»,</w:t>
+      </w:r>
+      <w:proofErr w:type="gramEnd"/>
+      <w:r>
+        <w:rPr>
+          <w:lang w:val="en-US"/>
+        </w:rPr>
+        <w:t> </w:t>
       </w:r>
       <w:r>
         <w:rPr>
@@ -2613,7 +4633,21 @@
         <w:rPr>
           <w:lang w:val="en-US"/>
         </w:rPr>
-        <w:t>, 5 de agosto de 2026. </w:t>
+        <w:t xml:space="preserve">, 5 de </w:t>
+      </w:r>
+      <w:proofErr w:type="spellStart"/>
+      <w:r>
+        <w:rPr>
+          <w:lang w:val="en-US"/>
+        </w:rPr>
+        <w:t>agosto</w:t>
+      </w:r>
+      <w:proofErr w:type="spellEnd"/>
+      <w:r>
+        <w:rPr>
+          <w:lang w:val="en-US"/>
+        </w:rPr>
+        <w:t xml:space="preserve"> de 2026. </w:t>
       </w:r>
       <w:hyperlink r:id="rId25" w:history="1">
         <w:r>
@@ -2626,11 +4660,6 @@
       </w:hyperlink>
     </w:p>
     <w:p>
-      <w:pPr>
-        <w:rPr>
-          <w:lang w:val="en-US"/>
-        </w:rPr>
-      </w:pPr>
       <w:r>
         <w:rPr>
           <w:lang w:val="en-US"/>
@@ -2641,7 +4670,35 @@
         <w:rPr>
           <w:lang w:val="en-US"/>
         </w:rPr>
-        <w:t>M. Requirements, M. Requirements, y M. Requirements, «Design Verification vs Design Validation: What’s the Difference and Why Do Both Matter?», </w:t>
+        <w:t xml:space="preserve">M. Requirements, M. Requirements, y M. </w:t>
+      </w:r>
+      <w:proofErr w:type="gramStart"/>
+      <w:r>
+        <w:rPr>
+          <w:lang w:val="en-US"/>
+        </w:rPr>
+        <w:t>Requirements, «</w:t>
+      </w:r>
+      <w:proofErr w:type="gramEnd"/>
+      <w:r>
+        <w:rPr>
+          <w:lang w:val="en-US"/>
+        </w:rPr>
+        <w:t xml:space="preserve">Design Verification vs Design Validation: What’s the Difference and Why Do Both </w:t>
+      </w:r>
+      <w:proofErr w:type="gramStart"/>
+      <w:r>
+        <w:rPr>
+          <w:lang w:val="en-US"/>
+        </w:rPr>
+        <w:t>Matter?»</w:t>
+      </w:r>
+      <w:proofErr w:type="gramEnd"/>
+      <w:r>
+        <w:rPr>
+          <w:lang w:val="en-US"/>
+        </w:rPr>
+        <w:t>, </w:t>
       </w:r>
       <w:r>
         <w:rPr>
@@ -2655,32 +4712,33 @@
         <w:rPr>
           <w:lang w:val="en-US"/>
         </w:rPr>
-        <w:t>, 17 de abril de 2026. </w:t>
+        <w:t xml:space="preserve">, 17 de </w:t>
+      </w:r>
+      <w:proofErr w:type="spellStart"/>
+      <w:r>
+        <w:rPr>
+          <w:lang w:val="en-US"/>
+        </w:rPr>
+        <w:t>abril</w:t>
+      </w:r>
+      <w:proofErr w:type="spellEnd"/>
+      <w:r>
+        <w:rPr>
+          <w:lang w:val="en-US"/>
+        </w:rPr>
+        <w:t xml:space="preserve"> de 2026. </w:t>
       </w:r>
       <w:hyperlink r:id="rId26" w:history="1">
         <w:r>
           <w:rPr>
             <w:rStyle w:val="Hipervnculo"/>
-            <w:lang w:val="en-US"/>
           </w:rPr>
           <w:t>https://www.modernrequirements.com/blogs/design-verification-vs-design-validation/</w:t>
         </w:r>
       </w:hyperlink>
     </w:p>
-    <w:p>
-      <w:pPr>
-        <w:rPr>
-          <w:lang w:val="en-US"/>
-        </w:rPr>
-      </w:pPr>
-    </w:p>
-    <w:p>
-      <w:pPr>
-        <w:rPr>
-          <w:lang w:val="en-US"/>
-        </w:rPr>
-      </w:pPr>
-    </w:p>
+    <w:p/>
+    <w:p/>
     <w:sectPr>
       <w:headerReference w:type="default" r:id="rId27"/>
       <w:footerReference w:type="default" r:id="rId28"/>
@@ -3731,6 +5789,7 @@
   <w:style w:type="character" w:default="1" w:styleId="Fuentedeprrafopredeter">
     <w:name w:val="Default Paragraph Font"/>
     <w:uiPriority w:val="1"/>
+    <w:semiHidden/>
     <w:unhideWhenUsed/>
   </w:style>
   <w:style w:type="table" w:default="1" w:styleId="Tablanormal">

</xml_diff>